<commit_message>
feat(ui/ux): comprehensive full-application UI/UX audit & remediation execution
- Data Integrity: fix journal entry UUIDs & period resolution, PO warehouse selector, stock transfer self-transfer validation, and store profile branch/warehouse metric error states.
- Shared Components & CSS: replace translucent dialog backgrounds with opaque theme tokens and implement responsive drawer width hook across all drawer consumers.
- Mobile Layout & Actions: add branch text ellipsis and secondary control collapsing in header, ensure action buttons wrap cleanly on mobile viewports.
- Visual Consistency: standardize date inputs with AntD DatePickers, sync ECharts with theme tokens, add single-line SKU ellipsis with tooltips and dynamic mobile shortcut hints in POS.
- Audits & Evidence: add FULL_APPLICATION_UI_UX_AUDIT_2026-10-22.md, REMEDIATION_EXECUTION_REPORT_2026-10-22.md, visual evidence screenshots, and comprehensive Playwright regression test suite.
</commit_message>
<xml_diff>
--- a/Proposal_Penawaran_Aplikasi_Enterprise_Inventory_POS.docx
+++ b/Proposal_Penawaran_Aplikasi_Enterprise_Inventory_POS.docx
@@ -13,7 +13,7 @@
           <w:color w:val="0D9488"/>
           <w:sz w:val="19"/>
         </w:rPr>
-        <w:t>DOKUMEN PENAWARAN RESMI  |  NO: PROP/EIPF/2026/L-01</w:t>
+        <w:t>DOKUMEN EKSPLORASI SOLUSI BISNIS  |  NO: PROP/EIPF/2026/V2</w:t>
         <w:br/>
       </w:r>
     </w:p>
@@ -28,24 +28,24 @@
           <w:rFonts w:ascii="Calibri" w:hAnsi="Calibri"/>
           <w:b/>
           <w:color w:val="1E3A8A"/>
-          <w:sz w:val="44"/>
+          <w:sz w:val="42"/>
         </w:rPr>
-        <w:t>PROPOSAL PENAWARAN LISENSI APLIKASI SISTEM TERPADU:</w:t>
+        <w:t>PROPOSAL SOLUSI DIGITALISASI OPERASIONAL BISNIS:</w:t>
         <w:br/>
-        <w:t>ENTERPRISE INVENTORY, POS &amp; FINANCIAL GOVERNANCE SYSTEM</w:t>
+        <w:t>INTEGRASI POINT OF SALE (POS), MANAJEMEN PERSEDIAAN &amp; TATA KELOLA KEUANGAN MANDIRI</w:t>
       </w:r>
     </w:p>
     <w:p>
       <w:pPr>
-        <w:spacing w:after="440"/>
+        <w:spacing w:after="400"/>
       </w:pPr>
       <w:r>
         <w:rPr>
           <w:rFonts w:ascii="Calibri" w:hAnsi="Calibri"/>
           <w:color w:val="1F2937"/>
-          <w:sz w:val="24"/>
+          <w:sz w:val="23"/>
         </w:rPr>
-        <w:t>Penjualan Lisensi Perangkat Lunak Penuh (Outright Perpetual License). Sistem Mandiri (On-Premise / Private Cloud), Bebas Biaya Sewa Berlangganan (No SaaS), Bebas Jumlah Cabang &amp; Pengguna (Unlimited), dengan Kedaulatan Data 100% Milik Perusahaan.</w:t>
+        <w:t>Modernisasi Sistem Operasional Toko &amp; Rantai Pasok Berbasis Hak Milik Mandiri (One-Time Perpetual License). Bebas Biaya Sewa Berlangganan Bulanan (No SaaS Fee), Tanpa Biaya Lisensi Tambahan per Kasir/User, serta Menjamin Kedaulatan Data Finansial 100% Milik Perusahaan Anda.</w:t>
       </w:r>
     </w:p>
     <w:tbl>
@@ -76,7 +76,7 @@
                 <w:color w:val="166534"/>
                 <w:sz w:val="20"/>
               </w:rPr>
-              <w:t>✓ SKEMA INVESTASI HAK MILIK SEUMUR HIDUP &amp; TERUJI STANDAR BANK-GRADE</w:t>
+              <w:t>✓ PENDEKATAN KEMITRAAN &amp; JAMINAN NILAI INVESTASI:</w:t>
               <w:br/>
             </w:r>
             <w:r>
@@ -84,7 +84,7 @@
                 <w:color w:val="15803D"/>
                 <w:sz w:val="19"/>
               </w:rPr>
-              <w:t>Investasi satu kali untuk kepemilikan software seumur hidup. Sistem telah lolos audit keamanan penetrasi otonom (PentAGI Security Audit) terhadap kebocoran kasir (Anti-IDOR), pencegahan stok minus serentak (Race Condition), validasi transaksi ketat, dan enkripsi kriptografi tingkat tinggi.</w:t>
+              <w:t>Proposal ini dirancang bukan sekadar untuk menawarkan aplikasi, melainkan sebagai solusi menyeluruh dalam menghilangkan kebocoran stok, mempercepat layanan kasir, dan mengotomatiskan pembukuan laba rugi. Investasi satu kali bayar (One-Time Capex) mencakup instalasi di server mandiri, migrasi data bisnis awal, pelatihan staf hingga lancar, serta jaminan garansi bebas bug.</w:t>
             </w:r>
           </w:p>
         </w:tc>
@@ -129,7 +129,7 @@
                 <w:color w:val="1F2937"/>
                 <w:sz w:val="20"/>
               </w:rPr>
-              <w:t>Direksi, Tim Manajemen Eksekutif &amp; Pemilik Perusahaan</w:t>
+              <w:t>Direksi, Tim Manajemen Eksekutif &amp; Pemilik Usaha</w:t>
             </w:r>
           </w:p>
         </w:tc>
@@ -146,7 +146,7 @@
                 <w:color w:val="1E3A8A"/>
                 <w:sz w:val="20"/>
               </w:rPr>
-              <w:t>Model Penawaran:</w:t>
+              <w:t>Model Kerjasama:</w:t>
             </w:r>
           </w:p>
         </w:tc>
@@ -160,7 +160,7 @@
                 <w:color w:val="1F2937"/>
                 <w:sz w:val="20"/>
               </w:rPr>
-              <w:t>Penjualan Lisensi Software Penuh (One-Time Perpetual License)</w:t>
+              <w:t>Solusi Sistem Mandiri Terpadu &amp; Jasa Implementasi Hulu-ke-Hilir</w:t>
             </w:r>
           </w:p>
         </w:tc>
@@ -177,7 +177,7 @@
                 <w:color w:val="1E3A8A"/>
                 <w:sz w:val="20"/>
               </w:rPr>
-              <w:t>Disusun Oleh:</w:t>
+              <w:t>Penyusun Dokumen:</w:t>
             </w:r>
           </w:p>
         </w:tc>
@@ -191,7 +191,7 @@
                 <w:color w:val="1F2937"/>
                 <w:sz w:val="20"/>
               </w:rPr>
-              <w:t>Tim Pengembang Solusi Teknologi Informasi</w:t>
+              <w:t>Tim Konsultan Solusi &amp; Arsitek Sistem Teknologi Informasi</w:t>
             </w:r>
           </w:p>
         </w:tc>
@@ -208,7 +208,7 @@
                 <w:color w:val="1E3A8A"/>
                 <w:sz w:val="20"/>
               </w:rPr>
-              <w:t>Status Aplikasi:</w:t>
+              <w:t>Kesiapan Sistem:</w:t>
             </w:r>
           </w:p>
         </w:tc>
@@ -222,7 +222,7 @@
                 <w:color w:val="1F2937"/>
                 <w:sz w:val="20"/>
               </w:rPr>
-              <w:t>Production-Ready &amp; Teruji Audit Keamanan Siber</w:t>
+              <w:t>Production-Ready, Teruji Keamanan Siber, &amp; Siap Uji Coba (Live Demo)</w:t>
             </w:r>
           </w:p>
         </w:tc>
@@ -244,7 +244,7 @@
           <w:color w:val="1E3A8A"/>
           <w:sz w:val="32"/>
         </w:rPr>
-        <w:t>1. Ringkasan Eksekutif (Executive Summary)</w:t>
+        <w:t>1. Diagnosa Masalah: Titik Rawan Operasional Ritel &amp; Distribusi</w:t>
       </w:r>
     </w:p>
     <w:p>
@@ -252,20 +252,105 @@
         <w:spacing w:after="160" w:line="276" w:lineRule="auto"/>
       </w:pPr>
       <w:r>
-        <w:t>Banyak pelaku bisnis ritel, distribusi, dan perdagangan saat ini merasa terjebak dalam skema sewa perangkat lunak (SaaS). Sistem SaaS mengenakan tarif per kasir, per cabang, dan per bulan secara berulang selamanya. Semakin berkembang cabang usaha dan jumlah staf kasir, tagihan bulanan justru melonjak drastis. Selain itu, basis data transaksi rahasia dan laporan keuangan perusahaan tersimpan di server pihak ketiga yang rawan kebocoran.</w:t>
+        <w:t>Dalam mengelola operasional ritel, cafe/restoran, toko grosir, maupun distribusi, pemilik bisnis dan manajemen sering menghadapi 4 (empat) titik kebocoran krusial yang mengikis profitabilitas tanpa disadari:</w:t>
       </w:r>
     </w:p>
     <w:p>
       <w:pPr>
-        <w:spacing w:after="280" w:line="276" w:lineRule="auto"/>
+        <w:spacing w:before="80" w:after="40"/>
       </w:pPr>
       <w:r>
-        <w:t>Proposal ini menawarkan solusi strategis berupa PENJUALAN LISENSI PENUH (PERPETUAL SOFTWARE LICENSE). Sistem terpadu ini mencakup operasional Point of Sale (POS) di kasir, manajemen multi-gudang dan rantai pasok, hingga pembukuan akuntansi otomatis berpasangan (Double-Entry General Ledger). Dengan model lisensi putus, perangkat lunak menjadi aset digital milik perusahaan Anda seumur hidup. Aplikasi dipasang langsung di server lokal kantor (On-Premise) atau Private Cloud milik Anda, menjamin 100% kedaulatan data finansial, kebebasan ekspansi toko tanpa biaya tambahan, dan efisiensi anggaran jangka panjang.</w:t>
+        <w:rPr>
+          <w:b/>
+          <w:color w:val="0D9488"/>
+          <w:sz w:val="20"/>
+        </w:rPr>
+        <w:t xml:space="preserve">A. Kebocoran Kasir &amp; Ketidakdisiplinan Laci Kas: </w:t>
+      </w:r>
+      <w:r>
+        <w:rPr>
+          <w:color w:val="1F2937"/>
+          <w:sz w:val="19"/>
+        </w:rPr>
+        <w:t>Pencatatan modal kas awal sering diabaikan, selisih uang setoran di akhir shift sulit ditelusuri pelakunya, dan adanya celah kecurangan staf berupa pembatalan struk (void liar) atau pemberian diskon sepihak.</w:t>
       </w:r>
     </w:p>
     <w:p>
       <w:pPr>
-        <w:spacing w:before="280" w:after="160"/>
+        <w:spacing w:before="80" w:after="40"/>
+      </w:pPr>
+      <w:r>
+        <w:rPr>
+          <w:b/>
+          <w:color w:val="0D9488"/>
+          <w:sz w:val="20"/>
+        </w:rPr>
+        <w:t xml:space="preserve">B. Selisih Persediaan Fisik vs Catatan (Stok Gaib): </w:t>
+      </w:r>
+      <w:r>
+        <w:rPr>
+          <w:color w:val="1F2937"/>
+          <w:sz w:val="19"/>
+        </w:rPr>
+        <w:t>Barang hilang atau rusak di gudang baru diketahui berbulan-bulan kemudian saat stok opname tahunan. Selain itu, kasir sering melakukan 'overselling' (menjual barang yang stok fisiknya sudah habis), atau toko kehabisan produk best-seller karena tidak adanya sistem peringatan batas pemesanan ulang (Reorder Point).</w:t>
+      </w:r>
+    </w:p>
+    <w:p>
+      <w:pPr>
+        <w:spacing w:before="80" w:after="40"/>
+      </w:pPr>
+      <w:r>
+        <w:rPr>
+          <w:b/>
+          <w:color w:val="0D9488"/>
+          <w:sz w:val="20"/>
+        </w:rPr>
+        <w:t xml:space="preserve">C. Laporan Keuangan Terfragmentasi &amp; Terlambat: </w:t>
+      </w:r>
+      <w:r>
+        <w:rPr>
+          <w:color w:val="1F2937"/>
+          <w:sz w:val="19"/>
+        </w:rPr>
+        <w:t>Data penjualan tersimpan di aplikasi kasir, mutasi stok dicatat di Excel terpisah, dan bukti faktur pembelian masih bertumpuk dalam nota manual. Akibatnya, pemilik bisnis baru mengetahui angka laba bersih berhari-hari bahkan berminggu-minggu setelah akhir bulan.</w:t>
+      </w:r>
+    </w:p>
+    <w:p>
+      <w:pPr>
+        <w:spacing w:before="80" w:after="40"/>
+      </w:pPr>
+      <w:r>
+        <w:rPr>
+          <w:b/>
+          <w:color w:val="0D9488"/>
+          <w:sz w:val="20"/>
+        </w:rPr>
+        <w:t xml:space="preserve">D. Jebakan Biaya Sewa Berlangganan (SaaS Lock-in): </w:t>
+      </w:r>
+      <w:r>
+        <w:rPr>
+          <w:color w:val="1F2937"/>
+          <w:sz w:val="19"/>
+        </w:rPr>
+        <w:t>Banyak pemilik bisnis merasa terbebani oleh model sewa software (SaaS) komersial yang mengenakan biaya per kasir, per cabang, dan per bulan. Semakin banyak cabang yang dibuka, biaya sewa melonjak berlipat ganda, sementara data finansial dan daftar pelanggan rahasia perusahaan tersimpan di cloud publik milik pihak ketiga yang berisiko disandera.</w:t>
+      </w:r>
+    </w:p>
+    <w:p>
+      <w:pPr>
+        <w:spacing w:before="160" w:after="280"/>
+      </w:pPr>
+      <w:r>
+        <w:rPr>
+          <w:i/>
+          <w:color w:val="1E3A8A"/>
+          <w:sz w:val="19"/>
+        </w:rPr>
+        <w:t>💡 SOLUSI KAMI: Menghadirkan sistem operasional terpadu yang memadukan Point of Sale (POS) ultra-cepat, manajemen gudang anti-kebocoran, serta akuntansi otomatis berpasangan (Double-Entry GL). Sistem ini kami serahkan secara penuh sebagai aset digital mandiri milik perusahaan Anda—tanpa tagihan sewa bulanan apapun selamanya.</w:t>
+      </w:r>
+    </w:p>
+    <w:p>
+      <w:pPr>
+        <w:spacing w:before="200" w:after="160"/>
       </w:pPr>
       <w:r>
         <w:rPr>
@@ -274,7 +359,7 @@
           <w:color w:val="1E3A8A"/>
           <w:sz w:val="32"/>
         </w:rPr>
-        <w:t>2. Studi Komparasi: Model Lisensi Penuh vs Model Sewa (SaaS)</w:t>
+        <w:t>2. Analisis Finansial: Model Sewa (SaaS) vs Sistem Mandiri (Hak Milik)</w:t>
       </w:r>
     </w:p>
     <w:tbl>
@@ -307,7 +392,7 @@
                 <w:color w:val="FFFFFF"/>
                 <w:sz w:val="19"/>
               </w:rPr>
-              <w:t>Aspek Analisis</w:t>
+              <w:t>Aspek Evaluasi Bisnis</w:t>
             </w:r>
           </w:p>
         </w:tc>
@@ -351,7 +436,7 @@
                 <w:color w:val="FFFFFF"/>
                 <w:sz w:val="19"/>
               </w:rPr>
-              <w:t>Model Lisensi Penuh (Penawaran Kami)</w:t>
+              <w:t>Model Sistem Mandiri (Solusi Kami)</w:t>
             </w:r>
           </w:p>
         </w:tc>
@@ -375,7 +460,7 @@
                 <w:color w:val="1E3A8A"/>
                 <w:sz w:val="18"/>
               </w:rPr>
-              <w:t>Biaya Perangkat Lunak</w:t>
+              <w:t>Skema Biaya Lisensi</w:t>
             </w:r>
           </w:p>
         </w:tc>
@@ -396,7 +481,7 @@
                 <w:color w:val="1F2937"/>
                 <w:sz w:val="18"/>
               </w:rPr>
-              <w:t>Biaya sewa berulang selamanya. Jika berhenti bayar, akses software langsung dicabut vendor.</w:t>
+              <w:t>Biaya sewa berulang selamanya. Jika berhenti bayar, akses software dan data langsung terputus.</w:t>
             </w:r>
           </w:p>
         </w:tc>
@@ -414,10 +499,11 @@
           <w:p>
             <w:r>
               <w:rPr>
-                <w:color w:val="0F766E"/>
+                <w:b/>
+                <w:color w:val="166534"/>
                 <w:sz w:val="18"/>
               </w:rPr>
-              <w:t>Investasi 1x di awal (One-time Capex). Lisensi berlaku seumur hidup tanpa tagihan sewa bulanan apapun.</w:t>
+              <w:t>Investasi 1x di awal (One-time Capex). Hak pakai seumur hidup tanpa tagihan sewa bulanan.</w:t>
             </w:r>
           </w:p>
         </w:tc>
@@ -441,7 +527,7 @@
                 <w:color w:val="1E3A8A"/>
                 <w:sz w:val="18"/>
               </w:rPr>
-              <w:t>Simulasi Biaya 3 Tahun (5 Toko)</w:t>
+              <w:t>Simulasi Biaya 3 Tahun (3-5 Cabang)</w:t>
             </w:r>
           </w:p>
         </w:tc>
@@ -462,7 +548,7 @@
                 <w:color w:val="1F2937"/>
                 <w:sz w:val="18"/>
               </w:rPr>
-              <w:t>± Rp 108.000.000,- (asumsi Rp 600rb/toko/bln untuk modul POS + Akuntansi).</w:t>
+              <w:t>± Rp 72.000.000,- s/d Rp 120.000.000,- (asumsi Rp 500rb - 800rb/cabang/bulan untuk POS + Akuntansi).</w:t>
             </w:r>
           </w:p>
         </w:tc>
@@ -480,10 +566,11 @@
           <w:p>
             <w:r>
               <w:rPr>
-                <w:color w:val="0F766E"/>
+                <w:b/>
+                <w:color w:val="166534"/>
                 <w:sz w:val="18"/>
               </w:rPr>
-              <w:t>Hanya Rp 35.000.000 - Rp 55.000.000,- sekali bayar. Menghemat puluhan hingga ratusan juta rupiah.</w:t>
+              <w:t>Jauh lebih hemat puluhan juta rupiah. Sekali bayar untuk seluruh modul terpadu.</w:t>
             </w:r>
           </w:p>
         </w:tc>
@@ -507,7 +594,7 @@
                 <w:color w:val="1E3A8A"/>
                 <w:sz w:val="18"/>
               </w:rPr>
-              <w:t>Kapasitas Cabang &amp; User</w:t>
+              <w:t>Ekspansi &amp; Tambah Perangkat</w:t>
             </w:r>
           </w:p>
         </w:tc>
@@ -528,7 +615,7 @@
                 <w:color w:val="1F2937"/>
                 <w:sz w:val="18"/>
               </w:rPr>
-              <w:t>Dibatasi ketat. Ada biaya tambahan setiap kali menambah user kasir atau membuka cabang baru.</w:t>
+              <w:t>Biaya naik setiap menambah kasir atau toko baru. Dibatasi lisensi per perangkat / per user.</w:t>
             </w:r>
           </w:p>
         </w:tc>
@@ -546,10 +633,11 @@
           <w:p>
             <w:r>
               <w:rPr>
-                <w:color w:val="0F766E"/>
+                <w:b/>
+                <w:color w:val="166534"/>
                 <w:sz w:val="18"/>
               </w:rPr>
-              <w:t>Bebas tanpa batas (Unlimited Outlets &amp; Users). Ekspansi 10 atau 50 cabang baru tanpa biaya lisensi lagi.</w:t>
+              <w:t>Tanpa Biaya Lisensi per User. Bebas tambah kasir tanpa biaya sewa tambahan. Pada Paket Enterprise, bebas membuka cabang baru tanpa beli lisensi lagi.</w:t>
             </w:r>
           </w:p>
         </w:tc>
@@ -594,7 +682,7 @@
                 <w:color w:val="1F2937"/>
                 <w:sz w:val="18"/>
               </w:rPr>
-              <w:t>Database tersimpan di cloud publik vendor, rentan diintip kompetitor atau bocor.</w:t>
+              <w:t>Database disimpan di cloud publik vendor, data omzet dan margin rawan dianalisis pihak luar.</w:t>
             </w:r>
           </w:p>
         </w:tc>
@@ -612,10 +700,11 @@
           <w:p>
             <w:r>
               <w:rPr>
-                <w:color w:val="0F766E"/>
+                <w:b/>
+                <w:color w:val="166534"/>
                 <w:sz w:val="18"/>
               </w:rPr>
-              <w:t>100% Data Sovereignty. Database PostgreSQL berada di server internal perusahaan Anda sendiri.</w:t>
+              <w:t>100% Data Sovereignty. Database berada di server milik perusahaan sendiri, terjaga kerahasiaannya.</w:t>
             </w:r>
           </w:p>
         </w:tc>
@@ -639,7 +728,7 @@
                 <w:color w:val="1E3A8A"/>
                 <w:sz w:val="18"/>
               </w:rPr>
-              <w:t>Ketergantungan Internet</w:t>
+              <w:t>Keandalan Saat Internet Padam</w:t>
             </w:r>
           </w:p>
         </w:tc>
@@ -660,7 +749,7 @@
                 <w:color w:val="1F2937"/>
                 <w:sz w:val="18"/>
               </w:rPr>
-              <w:t>Jika koneksi internet putus atau server vendor down, operasional kasir berhenti total.</w:t>
+              <w:t>Bila internet terputus atau server vendor bermasalah, kasir toko berhenti melayani.</w:t>
             </w:r>
           </w:p>
         </w:tc>
@@ -678,10 +767,11 @@
           <w:p>
             <w:r>
               <w:rPr>
-                <w:color w:val="0F766E"/>
+                <w:b/>
+                <w:color w:val="166534"/>
                 <w:sz w:val="18"/>
               </w:rPr>
-              <w:t>Mendukung jaringan intranet lokal (LAN). Meja kasir tetap melayani pelanggan saat internet eksternal padam.</w:t>
+              <w:t>Mendukung jaringan intranet lokal toko (LAN). Meja kasir tetap dapat beroperasi normal.</w:t>
             </w:r>
           </w:p>
         </w:tc>
@@ -703,365 +793,15 @@
           <w:color w:val="1E3A8A"/>
           <w:sz w:val="32"/>
         </w:rPr>
-        <w:t>3. Seluruh Modul Terpadu Termasuk dalam Satu Lisensi</w:t>
+        <w:t>3. Pilihan Paket Solusi &amp; Matriks Pembeda Fitur</w:t>
       </w:r>
     </w:p>
     <w:p>
       <w:pPr>
-        <w:spacing w:after="120"/>
+        <w:spacing w:after="160" w:line="276" w:lineRule="auto"/>
       </w:pPr>
       <w:r>
-        <w:t>Lisensi yang Anda beli mencakup **seluruh modul inti sistem** tanpa ada fitur yang dikunci atau dibatasi. Semua kemampuan berikut langsung aktif dan siap digunakan sejak hari pertama:</w:t>
-      </w:r>
-    </w:p>
-    <w:p>
-      <w:pPr>
-        <w:spacing w:before="160" w:after="40"/>
-      </w:pPr>
-      <w:r>
-        <w:rPr>
-          <w:rFonts w:ascii="Calibri" w:hAnsi="Calibri"/>
-          <w:b/>
-          <w:color w:val="0D9488"/>
-          <w:sz w:val="23"/>
-        </w:rPr>
-        <w:t>A. Modul Point of Sale (POS) &amp; Kasir Cepat</w:t>
-      </w:r>
-    </w:p>
-    <w:p>
-      <w:pPr>
-        <w:pStyle w:val="ListBullet"/>
-        <w:spacing w:after="40" w:line="276" w:lineRule="auto"/>
-      </w:pPr>
-      <w:r>
-        <w:rPr>
-          <w:rFonts w:ascii="Calibri" w:hAnsi="Calibri"/>
-          <w:color w:val="1F2937"/>
-          <w:sz w:val="19"/>
-        </w:rPr>
-        <w:t>Antarmuka kasir ultra-responsif, kompatibel dengan barcode scanner laser, printer thermal struk, dan laci uang otomatis (cash drawer).</w:t>
-      </w:r>
-    </w:p>
-    <w:p>
-      <w:pPr>
-        <w:pStyle w:val="ListBullet"/>
-        <w:spacing w:after="40" w:line="276" w:lineRule="auto"/>
-      </w:pPr>
-      <w:r>
-        <w:rPr>
-          <w:rFonts w:ascii="Calibri" w:hAnsi="Calibri"/>
-          <w:color w:val="1F2937"/>
-          <w:sz w:val="19"/>
-        </w:rPr>
-        <w:t>Manajemen Shift &amp; Laci Kasir: Wajib input modal kas awal, pencatatan kas kecil (petty cash), dan blind count saat tutup shift.</w:t>
-      </w:r>
-    </w:p>
-    <w:p>
-      <w:pPr>
-        <w:pStyle w:val="ListBullet"/>
-        <w:spacing w:after="40" w:line="276" w:lineRule="auto"/>
-      </w:pPr>
-      <w:r>
-        <w:rPr>
-          <w:rFonts w:ascii="Calibri" w:hAnsi="Calibri"/>
-          <w:color w:val="1F2937"/>
-          <w:sz w:val="19"/>
-        </w:rPr>
-        <w:t>Multi-Metode Pembayaran: Pembayaran Tunai, QRIS dinamis/statis, EDC Debit/Kredit, Transfer Bank, dan Piutang Jatuh Tempo Pelanggan.</w:t>
-      </w:r>
-    </w:p>
-    <w:p>
-      <w:pPr>
-        <w:pStyle w:val="ListBullet"/>
-        <w:spacing w:after="40" w:line="276" w:lineRule="auto"/>
-      </w:pPr>
-      <w:r>
-        <w:rPr>
-          <w:rFonts w:ascii="Calibri" w:hAnsi="Calibri"/>
-          <w:color w:val="1F2937"/>
-          <w:sz w:val="19"/>
-        </w:rPr>
-        <w:t>Pencegahan Fraud Kasir: Proteksi void struk berbasis hak akses supervisor, batasan diskon staf maksimal, dan larangan harga minus.</w:t>
-      </w:r>
-    </w:p>
-    <w:p>
-      <w:pPr>
-        <w:spacing w:before="160" w:after="40"/>
-      </w:pPr>
-      <w:r>
-        <w:rPr>
-          <w:rFonts w:ascii="Calibri" w:hAnsi="Calibri"/>
-          <w:b/>
-          <w:color w:val="0D9488"/>
-          <w:sz w:val="23"/>
-        </w:rPr>
-        <w:t>B. Modul Manajemen Pergudangan &amp; Inventaris (Multi-Warehouse Engine)</w:t>
-      </w:r>
-    </w:p>
-    <w:p>
-      <w:pPr>
-        <w:pStyle w:val="ListBullet"/>
-        <w:spacing w:after="40" w:line="276" w:lineRule="auto"/>
-      </w:pPr>
-      <w:r>
-        <w:rPr>
-          <w:rFonts w:ascii="Calibri" w:hAnsi="Calibri"/>
-          <w:color w:val="1F2937"/>
-          <w:sz w:val="19"/>
-        </w:rPr>
-        <w:t>Multi-Cabang &amp; Multi-Gudang: Tata kelola terpisah antara gudang utama logistik, gudang display toko cabang, maupun gudang retur.</w:t>
-      </w:r>
-    </w:p>
-    <w:p>
-      <w:pPr>
-        <w:pStyle w:val="ListBullet"/>
-        <w:spacing w:after="40" w:line="276" w:lineRule="auto"/>
-      </w:pPr>
-      <w:r>
-        <w:rPr>
-          <w:rFonts w:ascii="Calibri" w:hAnsi="Calibri"/>
-          <w:color w:val="1F2937"/>
-          <w:sz w:val="19"/>
-        </w:rPr>
-        <w:t>Row-Level Database Locking (Anti-Stok Minus): Menjamin tidak akan pernah terjadi overselling meskipun kasir checkout serentak.</w:t>
-      </w:r>
-    </w:p>
-    <w:p>
-      <w:pPr>
-        <w:pStyle w:val="ListBullet"/>
-        <w:spacing w:after="40" w:line="276" w:lineRule="auto"/>
-      </w:pPr>
-      <w:r>
-        <w:rPr>
-          <w:rFonts w:ascii="Calibri" w:hAnsi="Calibri"/>
-          <w:color w:val="1F2937"/>
-          <w:sz w:val="19"/>
-        </w:rPr>
-        <w:t>Surat Jalan &amp; Transfer Stok Antar Cabang: Alur mutasi stok antar cabang lengkap dengan status verifikasi terima fisik barang.</w:t>
-      </w:r>
-    </w:p>
-    <w:p>
-      <w:pPr>
-        <w:pStyle w:val="ListBullet"/>
-        <w:spacing w:after="40" w:line="276" w:lineRule="auto"/>
-      </w:pPr>
-      <w:r>
-        <w:rPr>
-          <w:rFonts w:ascii="Calibri" w:hAnsi="Calibri"/>
-          <w:color w:val="1F2937"/>
-          <w:sz w:val="19"/>
-        </w:rPr>
-        <w:t>Stock Opname Digital: Fitur audit fisik berkala, menghitung selisih persediaan fisik dengan catatan sistem dan auto-adjustment.</w:t>
-      </w:r>
-    </w:p>
-    <w:p>
-      <w:pPr>
-        <w:spacing w:before="160" w:after="40"/>
-      </w:pPr>
-      <w:r>
-        <w:rPr>
-          <w:rFonts w:ascii="Calibri" w:hAnsi="Calibri"/>
-          <w:b/>
-          <w:color w:val="0D9488"/>
-          <w:sz w:val="23"/>
-        </w:rPr>
-        <w:t>C. Modul Pengadaan &amp; Rantai Pasok (Purchasing &amp; Supply Chain)</w:t>
-      </w:r>
-    </w:p>
-    <w:p>
-      <w:pPr>
-        <w:pStyle w:val="ListBullet"/>
-        <w:spacing w:after="40" w:line="276" w:lineRule="auto"/>
-      </w:pPr>
-      <w:r>
-        <w:rPr>
-          <w:rFonts w:ascii="Calibri" w:hAnsi="Calibri"/>
-          <w:color w:val="1F2937"/>
-          <w:sz w:val="19"/>
-        </w:rPr>
-        <w:t>Purchase Request (PR) &amp; Purchase Order (PO) otomatis saat stok barang mencapai batas minimum pemesanan ulang (Reorder Point).</w:t>
-      </w:r>
-    </w:p>
-    <w:p>
-      <w:pPr>
-        <w:pStyle w:val="ListBullet"/>
-        <w:spacing w:after="40" w:line="276" w:lineRule="auto"/>
-      </w:pPr>
-      <w:r>
-        <w:rPr>
-          <w:rFonts w:ascii="Calibri" w:hAnsi="Calibri"/>
-          <w:color w:val="1F2937"/>
-          <w:sz w:val="19"/>
-        </w:rPr>
-        <w:t>Penerimaan Barang (Goods Receipt / GR) dengan pencocokan parsial terhadap dokumen pesanan dan faktur pemasok.</w:t>
-      </w:r>
-    </w:p>
-    <w:p>
-      <w:pPr>
-        <w:pStyle w:val="ListBullet"/>
-        <w:spacing w:after="40" w:line="276" w:lineRule="auto"/>
-      </w:pPr>
-      <w:r>
-        <w:rPr>
-          <w:rFonts w:ascii="Calibri" w:hAnsi="Calibri"/>
-          <w:color w:val="1F2937"/>
-          <w:sz w:val="19"/>
-        </w:rPr>
-        <w:t>Retur Pembelian (Purchase Return) terintegrasi langsung dengan pemotongan hutang dagang supplier (Debit Note).</w:t>
-      </w:r>
-    </w:p>
-    <w:p>
-      <w:pPr>
-        <w:spacing w:before="160" w:after="40"/>
-      </w:pPr>
-      <w:r>
-        <w:rPr>
-          <w:rFonts w:ascii="Calibri" w:hAnsi="Calibri"/>
-          <w:b/>
-          <w:color w:val="0D9488"/>
-          <w:sz w:val="23"/>
-        </w:rPr>
-        <w:t>D. Modul Akuntansi &amp; Tata Kelola Keuangan (Financial Governance)</w:t>
-      </w:r>
-    </w:p>
-    <w:p>
-      <w:pPr>
-        <w:pStyle w:val="ListBullet"/>
-        <w:spacing w:after="40" w:line="276" w:lineRule="auto"/>
-      </w:pPr>
-      <w:r>
-        <w:rPr>
-          <w:rFonts w:ascii="Calibri" w:hAnsi="Calibri"/>
-          <w:color w:val="1F2937"/>
-          <w:sz w:val="19"/>
-        </w:rPr>
-        <w:t>Chart of Accounts (COA) Fleksibel: Struktur bagan akun standar akuntansi Indonesia yang dapat disesuaikan dengan kebutuhan perusahaan.</w:t>
-      </w:r>
-    </w:p>
-    <w:p>
-      <w:pPr>
-        <w:pStyle w:val="ListBullet"/>
-        <w:spacing w:after="40" w:line="276" w:lineRule="auto"/>
-      </w:pPr>
-      <w:r>
-        <w:rPr>
-          <w:rFonts w:ascii="Calibri" w:hAnsi="Calibri"/>
-          <w:color w:val="1F2937"/>
-          <w:sz w:val="19"/>
-        </w:rPr>
-        <w:t>Otomatisasi Jurnal Umum (Double-Entry): Setiap transaksi POS kasir dan mutasi barang langsung membentuk jurnal debit-kredit otomatis.</w:t>
-      </w:r>
-    </w:p>
-    <w:p>
-      <w:pPr>
-        <w:pStyle w:val="ListBullet"/>
-        <w:spacing w:after="40" w:line="276" w:lineRule="auto"/>
-      </w:pPr>
-      <w:r>
-        <w:rPr>
-          <w:rFonts w:ascii="Calibri" w:hAnsi="Calibri"/>
-          <w:color w:val="1F2937"/>
-          <w:sz w:val="19"/>
-        </w:rPr>
-        <w:t>Laporan Keuangan Real-Time Standar SAK: Laporan Laba Rugi (Income Statement), Neraca Keuangan (Balance Sheet), dan Arus Kas (Cash Flow).</w:t>
-      </w:r>
-    </w:p>
-    <w:p>
-      <w:pPr>
-        <w:pStyle w:val="ListBullet"/>
-        <w:spacing w:after="40" w:line="276" w:lineRule="auto"/>
-      </w:pPr>
-      <w:r>
-        <w:rPr>
-          <w:rFonts w:ascii="Calibri" w:hAnsi="Calibri"/>
-          <w:color w:val="1F2937"/>
-          <w:sz w:val="19"/>
-        </w:rPr>
-        <w:t>Manajemen Piutang Usaha (AR) &amp; Hutang Usaha (AP): Lengkap dengan tabel umur piutang (Aging Schedule) untuk mengontrol likuiditas.</w:t>
-      </w:r>
-    </w:p>
-    <w:p>
-      <w:pPr>
-        <w:pStyle w:val="ListBullet"/>
-        <w:spacing w:after="40" w:line="276" w:lineRule="auto"/>
-      </w:pPr>
-      <w:r>
-        <w:rPr>
-          <w:rFonts w:ascii="Calibri" w:hAnsi="Calibri"/>
-          <w:color w:val="1F2937"/>
-          <w:sz w:val="19"/>
-        </w:rPr>
-        <w:t>Rekonsiliasi Bank: Modul pencocokan mutasi rekening koran bank dengan catatan kas internal secara otomatis.</w:t>
-      </w:r>
-    </w:p>
-    <w:p>
-      <w:pPr>
-        <w:spacing w:before="160" w:after="40"/>
-      </w:pPr>
-      <w:r>
-        <w:rPr>
-          <w:rFonts w:ascii="Calibri" w:hAnsi="Calibri"/>
-          <w:b/>
-          <w:color w:val="0D9488"/>
-          <w:sz w:val="23"/>
-        </w:rPr>
-        <w:t>E. Modul Keamanan Siber Bank-Grade &amp; Audit Trail (PentAGI Verified)</w:t>
-      </w:r>
-    </w:p>
-    <w:p>
-      <w:pPr>
-        <w:pStyle w:val="ListBullet"/>
-        <w:spacing w:after="40" w:line="276" w:lineRule="auto"/>
-      </w:pPr>
-      <w:r>
-        <w:rPr>
-          <w:rFonts w:ascii="Calibri" w:hAnsi="Calibri"/>
-          <w:color w:val="1F2937"/>
-          <w:sz w:val="19"/>
-        </w:rPr>
-        <w:t>Role-Based Access Control (RBAC): Pemisahan wewenang bertingkat (Owner, Finance Manager, Warehouse, Purchasing, Kasir).</w:t>
-      </w:r>
-    </w:p>
-    <w:p>
-      <w:pPr>
-        <w:pStyle w:val="ListBullet"/>
-        <w:spacing w:after="40" w:line="276" w:lineRule="auto"/>
-      </w:pPr>
-      <w:r>
-        <w:rPr>
-          <w:rFonts w:ascii="Calibri" w:hAnsi="Calibri"/>
-          <w:color w:val="1F2937"/>
-          <w:sz w:val="19"/>
-        </w:rPr>
-        <w:t>Keamanan Terverifikasi PentAGI: Teruji tangguh terhadap serangan IDOR shift kasir, pembobolan otorisasi, dan race condition stok.</w:t>
-      </w:r>
-    </w:p>
-    <w:p>
-      <w:pPr>
-        <w:pStyle w:val="ListBullet"/>
-        <w:spacing w:after="40" w:line="276" w:lineRule="auto"/>
-      </w:pPr>
-      <w:r>
-        <w:rPr>
-          <w:rFonts w:ascii="Calibri" w:hAnsi="Calibri"/>
-          <w:color w:val="1F2937"/>
-          <w:sz w:val="19"/>
-        </w:rPr>
-        <w:t>Immutable Audit Log: Setiap perubahan data produk, harga jual, transaksi kasir, dan jurnal tersimpan permanen tanpa bisa dihapus staf.</w:t>
-      </w:r>
-    </w:p>
-    <w:p>
-      <w:pPr>
-        <w:spacing w:before="280" w:after="160"/>
-      </w:pPr>
-      <w:r>
-        <w:rPr>
-          <w:rFonts w:ascii="Calibri" w:hAnsi="Calibri"/>
-          <w:b/>
-          <w:color w:val="1E3A8A"/>
-          <w:sz w:val="32"/>
-        </w:rPr>
-        <w:t>4. Arsitektur Teknologi &amp; Kesiapan Skalabilitas</w:t>
+        <w:t>Agar investasi tepat sasaran sesuai skala bisnis dan anggaran perusahaan Anda, kami menyediakan 2 (dua) opsi paket implementasi sistem mandiri dengan rincian fitur sebagai berikut:</w:t>
       </w:r>
     </w:p>
     <w:tbl>
@@ -1094,7 +834,7 @@
                 <w:color w:val="FFFFFF"/>
                 <w:sz w:val="19"/>
               </w:rPr>
-              <w:t>Komponen Sistem</w:t>
+              <w:t>Fitur &amp; Cakupan Kemampuan</w:t>
             </w:r>
           </w:p>
         </w:tc>
@@ -1110,13 +850,18 @@
             </w:tcMar>
           </w:tcPr>
           <w:p>
+            <w:pPr>
+              <w:jc w:val="center"/>
+            </w:pPr>
             <w:r>
               <w:rPr>
                 <w:b/>
                 <w:color w:val="FFFFFF"/>
                 <w:sz w:val="19"/>
               </w:rPr>
-              <w:t>Teknologi Enterprise</w:t>
+              <w:t>Paket STARTER</w:t>
+              <w:br/>
+              <w:t>(Single Outlet / Retail Mandiri)</w:t>
             </w:r>
           </w:p>
         </w:tc>
@@ -1132,936 +877,18 @@
             </w:tcMar>
           </w:tcPr>
           <w:p>
+            <w:pPr>
+              <w:jc w:val="center"/>
+            </w:pPr>
             <w:r>
               <w:rPr>
                 <w:b/>
                 <w:color w:val="FFFFFF"/>
                 <w:sz w:val="19"/>
               </w:rPr>
-              <w:t>Keunggulan bagi Perusahaan Klien</w:t>
-            </w:r>
-          </w:p>
-        </w:tc>
-      </w:tr>
-      <w:tr>
-        <w:tc>
-          <w:tcPr>
-            <w:tcW w:type="dxa" w:w="3120"/>
-            <w:shd w:fill="FFFFFF"/>
-            <w:tcMar>
-              <w:top w:w="110" w:type="dxa"/>
-              <w:bottom w:w="110" w:type="dxa"/>
-              <w:left w:w="130" w:type="dxa"/>
-              <w:right w:w="130" w:type="dxa"/>
-            </w:tcMar>
-          </w:tcPr>
-          <w:p>
-            <w:r>
-              <w:rPr>
-                <w:b/>
-                <w:color w:val="1E3A8A"/>
-                <w:sz w:val="18"/>
-              </w:rPr>
-              <w:t>Backend Engine</w:t>
-            </w:r>
-          </w:p>
-        </w:tc>
-        <w:tc>
-          <w:tcPr>
-            <w:tcW w:type="dxa" w:w="3120"/>
-            <w:shd w:fill="FFFFFF"/>
-            <w:tcMar>
-              <w:top w:w="110" w:type="dxa"/>
-              <w:bottom w:w="110" w:type="dxa"/>
-              <w:left w:w="130" w:type="dxa"/>
-              <w:right w:w="130" w:type="dxa"/>
-            </w:tcMar>
-          </w:tcPr>
-          <w:p>
-            <w:r>
-              <w:rPr>
-                <w:color w:val="1F2937"/>
-                <w:sz w:val="18"/>
-              </w:rPr>
-              <w:t>NestJS (TypeScript Enterprise)</w:t>
-            </w:r>
-          </w:p>
-        </w:tc>
-        <w:tc>
-          <w:tcPr>
-            <w:tcW w:type="dxa" w:w="3120"/>
-            <w:shd w:fill="FFFFFF"/>
-            <w:tcMar>
-              <w:top w:w="110" w:type="dxa"/>
-              <w:bottom w:w="110" w:type="dxa"/>
-              <w:left w:w="130" w:type="dxa"/>
-              <w:right w:w="130" w:type="dxa"/>
-            </w:tcMar>
-          </w:tcPr>
-          <w:p>
-            <w:r>
-              <w:rPr>
-                <w:color w:val="1F2937"/>
-                <w:sz w:val="18"/>
-              </w:rPr>
-              <w:t>Kinerja pemrosesan tinggi, arsitektur modular standar industri, mudah diintegrasikan.</w:t>
-            </w:r>
-          </w:p>
-        </w:tc>
-      </w:tr>
-      <w:tr>
-        <w:tc>
-          <w:tcPr>
-            <w:tcW w:type="dxa" w:w="3120"/>
-            <w:shd w:fill="F9FAFB"/>
-            <w:tcMar>
-              <w:top w:w="110" w:type="dxa"/>
-              <w:bottom w:w="110" w:type="dxa"/>
-              <w:left w:w="130" w:type="dxa"/>
-              <w:right w:w="130" w:type="dxa"/>
-            </w:tcMar>
-          </w:tcPr>
-          <w:p>
-            <w:r>
-              <w:rPr>
-                <w:b/>
-                <w:color w:val="1E3A8A"/>
-                <w:sz w:val="18"/>
-              </w:rPr>
-              <w:t>Frontend Web POS</w:t>
-            </w:r>
-          </w:p>
-        </w:tc>
-        <w:tc>
-          <w:tcPr>
-            <w:tcW w:type="dxa" w:w="3120"/>
-            <w:shd w:fill="F9FAFB"/>
-            <w:tcMar>
-              <w:top w:w="110" w:type="dxa"/>
-              <w:bottom w:w="110" w:type="dxa"/>
-              <w:left w:w="130" w:type="dxa"/>
-              <w:right w:w="130" w:type="dxa"/>
-            </w:tcMar>
-          </w:tcPr>
-          <w:p>
-            <w:r>
-              <w:rPr>
-                <w:color w:val="1F2937"/>
-                <w:sz w:val="18"/>
-              </w:rPr>
-              <w:t>React 19 + Vite SPA</w:t>
-            </w:r>
-          </w:p>
-        </w:tc>
-        <w:tc>
-          <w:tcPr>
-            <w:tcW w:type="dxa" w:w="3120"/>
-            <w:shd w:fill="F9FAFB"/>
-            <w:tcMar>
-              <w:top w:w="110" w:type="dxa"/>
-              <w:bottom w:w="110" w:type="dxa"/>
-              <w:left w:w="130" w:type="dxa"/>
-              <w:right w:w="130" w:type="dxa"/>
-            </w:tcMar>
-          </w:tcPr>
-          <w:p>
-            <w:r>
-              <w:rPr>
-                <w:color w:val="1F2937"/>
-                <w:sz w:val="18"/>
-              </w:rPr>
-              <w:t>Beban akses halaman ultra cepat (&lt;0.5 detik), tidak membutuhkan komputer kasir berspesifikasi tinggi.</w:t>
-            </w:r>
-          </w:p>
-        </w:tc>
-      </w:tr>
-      <w:tr>
-        <w:tc>
-          <w:tcPr>
-            <w:tcW w:type="dxa" w:w="3120"/>
-            <w:shd w:fill="FFFFFF"/>
-            <w:tcMar>
-              <w:top w:w="110" w:type="dxa"/>
-              <w:bottom w:w="110" w:type="dxa"/>
-              <w:left w:w="130" w:type="dxa"/>
-              <w:right w:w="130" w:type="dxa"/>
-            </w:tcMar>
-          </w:tcPr>
-          <w:p>
-            <w:r>
-              <w:rPr>
-                <w:b/>
-                <w:color w:val="1E3A8A"/>
-                <w:sz w:val="18"/>
-              </w:rPr>
-              <w:t>Relational Database</w:t>
-            </w:r>
-          </w:p>
-        </w:tc>
-        <w:tc>
-          <w:tcPr>
-            <w:tcW w:type="dxa" w:w="3120"/>
-            <w:shd w:fill="FFFFFF"/>
-            <w:tcMar>
-              <w:top w:w="110" w:type="dxa"/>
-              <w:bottom w:w="110" w:type="dxa"/>
-              <w:left w:w="130" w:type="dxa"/>
-              <w:right w:w="130" w:type="dxa"/>
-            </w:tcMar>
-          </w:tcPr>
-          <w:p>
-            <w:r>
-              <w:rPr>
-                <w:color w:val="1F2937"/>
-                <w:sz w:val="18"/>
-              </w:rPr>
-              <w:t>PostgreSQL 16 Enterprise</w:t>
-            </w:r>
-          </w:p>
-        </w:tc>
-        <w:tc>
-          <w:tcPr>
-            <w:tcW w:type="dxa" w:w="3120"/>
-            <w:shd w:fill="FFFFFF"/>
-            <w:tcMar>
-              <w:top w:w="110" w:type="dxa"/>
-              <w:bottom w:w="110" w:type="dxa"/>
-              <w:left w:w="130" w:type="dxa"/>
-              <w:right w:w="130" w:type="dxa"/>
-            </w:tcMar>
-          </w:tcPr>
-          <w:p>
-            <w:r>
-              <w:rPr>
-                <w:color w:val="1F2937"/>
-                <w:sz w:val="18"/>
-              </w:rPr>
-              <w:t>Standar keamanan perbankan, kepatuhan transaksi ACID, dan keandalan data finansial.</w:t>
-            </w:r>
-          </w:p>
-        </w:tc>
-      </w:tr>
-      <w:tr>
-        <w:tc>
-          <w:tcPr>
-            <w:tcW w:type="dxa" w:w="3120"/>
-            <w:shd w:fill="F9FAFB"/>
-            <w:tcMar>
-              <w:top w:w="110" w:type="dxa"/>
-              <w:bottom w:w="110" w:type="dxa"/>
-              <w:left w:w="130" w:type="dxa"/>
-              <w:right w:w="130" w:type="dxa"/>
-            </w:tcMar>
-          </w:tcPr>
-          <w:p>
-            <w:r>
-              <w:rPr>
-                <w:b/>
-                <w:color w:val="1E3A8A"/>
-                <w:sz w:val="18"/>
-              </w:rPr>
-              <w:t>In-Memory Caching</w:t>
-            </w:r>
-          </w:p>
-        </w:tc>
-        <w:tc>
-          <w:tcPr>
-            <w:tcW w:type="dxa" w:w="3120"/>
-            <w:shd w:fill="F9FAFB"/>
-            <w:tcMar>
-              <w:top w:w="110" w:type="dxa"/>
-              <w:bottom w:w="110" w:type="dxa"/>
-              <w:left w:w="130" w:type="dxa"/>
-              <w:right w:w="130" w:type="dxa"/>
-            </w:tcMar>
-          </w:tcPr>
-          <w:p>
-            <w:r>
-              <w:rPr>
-                <w:color w:val="1F2937"/>
-                <w:sz w:val="18"/>
-              </w:rPr>
-              <w:t>Redis 7 High-Speed Store</w:t>
-            </w:r>
-          </w:p>
-        </w:tc>
-        <w:tc>
-          <w:tcPr>
-            <w:tcW w:type="dxa" w:w="3120"/>
-            <w:shd w:fill="F9FAFB"/>
-            <w:tcMar>
-              <w:top w:w="110" w:type="dxa"/>
-              <w:bottom w:w="110" w:type="dxa"/>
-              <w:left w:w="130" w:type="dxa"/>
-              <w:right w:w="130" w:type="dxa"/>
-            </w:tcMar>
-          </w:tcPr>
-          <w:p>
-            <w:r>
-              <w:rPr>
-                <w:color w:val="1F2937"/>
-                <w:sz w:val="18"/>
-              </w:rPr>
-              <w:t>Eksekusi session kasir dan proteksi penembakan sistem (rate-limit) dalam hitungan sub-milidetik.</w:t>
-            </w:r>
-          </w:p>
-        </w:tc>
-      </w:tr>
-    </w:tbl>
-    <w:p>
-      <w:r>
-        <w:br w:type="page"/>
-      </w:r>
-    </w:p>
-    <w:p>
-      <w:pPr>
-        <w:spacing w:before="240" w:after="160"/>
-      </w:pPr>
-      <w:r>
-        <w:rPr>
-          <w:rFonts w:ascii="Calibri" w:hAnsi="Calibri"/>
-          <w:b/>
-          <w:color w:val="1E3A8A"/>
-          <w:sz w:val="32"/>
-        </w:rPr>
-        <w:t>5. Struktur Investasi Lisensi Penuh &amp; Skema Pembayaran</w:t>
-      </w:r>
-    </w:p>
-    <w:p>
-      <w:pPr>
-        <w:spacing w:after="160" w:line="276" w:lineRule="auto"/>
-      </w:pPr>
-      <w:r>
-        <w:t>Penawaran ini merupakan paket implementasi terpadu hulu-ke-hilir. Klien memperoleh hak milik lisensi software secara penuh, instalasi di server klien, konfigurasi Chart of Accounts, migrasi data master, serta pelatihan seluruh staf operasional:</w:t>
-      </w:r>
-    </w:p>
-    <w:tbl>
-      <w:tblPr>
-        <w:tblW w:type="auto" w:w="0"/>
-        <w:jc w:val="center"/>
-        <w:tblLook w:firstColumn="1" w:firstRow="1" w:lastColumn="0" w:lastRow="0" w:noHBand="0" w:noVBand="1" w:val="04A0"/>
-      </w:tblPr>
-      <w:tblGrid>
-        <w:gridCol w:w="3120"/>
-        <w:gridCol w:w="3120"/>
-        <w:gridCol w:w="3120"/>
-      </w:tblGrid>
-      <w:tr>
-        <w:tc>
-          <w:tcPr>
-            <w:tcW w:type="dxa" w:w="3120"/>
-            <w:shd w:fill="1E3A8A"/>
-            <w:tcMar>
-              <w:top w:w="140" w:type="dxa"/>
-              <w:bottom w:w="140" w:type="dxa"/>
-              <w:left w:w="150" w:type="dxa"/>
-              <w:right w:w="150" w:type="dxa"/>
-            </w:tcMar>
-          </w:tcPr>
-          <w:p>
-            <w:r>
-              <w:rPr>
-                <w:b/>
-                <w:color w:val="FFFFFF"/>
-                <w:sz w:val="19"/>
-              </w:rPr>
-              <w:t>Komponen Pekerjaan</w:t>
-            </w:r>
-          </w:p>
-        </w:tc>
-        <w:tc>
-          <w:tcPr>
-            <w:tcW w:type="dxa" w:w="3120"/>
-            <w:shd w:fill="1E3A8A"/>
-            <w:tcMar>
-              <w:top w:w="140" w:type="dxa"/>
-              <w:bottom w:w="140" w:type="dxa"/>
-              <w:left w:w="150" w:type="dxa"/>
-              <w:right w:w="150" w:type="dxa"/>
-            </w:tcMar>
-          </w:tcPr>
-          <w:p>
-            <w:r>
-              <w:rPr>
-                <w:b/>
-                <w:color w:val="FFFFFF"/>
-                <w:sz w:val="19"/>
-              </w:rPr>
-              <w:t>Uraian &amp; Spesifikasi Deliverable</w:t>
-            </w:r>
-          </w:p>
-        </w:tc>
-        <w:tc>
-          <w:tcPr>
-            <w:tcW w:type="dxa" w:w="3120"/>
-            <w:shd w:fill="1E3A8A"/>
-            <w:tcMar>
-              <w:top w:w="140" w:type="dxa"/>
-              <w:bottom w:w="140" w:type="dxa"/>
-              <w:left w:w="150" w:type="dxa"/>
-              <w:right w:w="150" w:type="dxa"/>
-            </w:tcMar>
-          </w:tcPr>
-          <w:p>
-            <w:r>
-              <w:rPr>
-                <w:b/>
-                <w:color w:val="FFFFFF"/>
-                <w:sz w:val="19"/>
-              </w:rPr>
-              <w:t>Status / Keterangan</w:t>
-            </w:r>
-          </w:p>
-        </w:tc>
-      </w:tr>
-      <w:tr>
-        <w:tc>
-          <w:tcPr>
-            <w:tcW w:type="dxa" w:w="3120"/>
-            <w:shd w:fill="FFFFFF"/>
-            <w:tcMar>
-              <w:top w:w="110" w:type="dxa"/>
-              <w:bottom w:w="110" w:type="dxa"/>
-              <w:left w:w="130" w:type="dxa"/>
-              <w:right w:w="130" w:type="dxa"/>
-            </w:tcMar>
-          </w:tcPr>
-          <w:p>
-            <w:r>
-              <w:rPr>
-                <w:b/>
-                <w:color w:val="1E3A8A"/>
-                <w:sz w:val="18"/>
-              </w:rPr>
-              <w:t>1. Lisensi Software Penuh (Perpetual License)</w:t>
-            </w:r>
-          </w:p>
-        </w:tc>
-        <w:tc>
-          <w:tcPr>
-            <w:tcW w:type="dxa" w:w="3120"/>
-            <w:shd w:fill="FFFFFF"/>
-            <w:tcMar>
-              <w:top w:w="110" w:type="dxa"/>
-              <w:bottom w:w="110" w:type="dxa"/>
-              <w:left w:w="130" w:type="dxa"/>
-              <w:right w:w="130" w:type="dxa"/>
-            </w:tcMar>
-          </w:tcPr>
-          <w:p>
-            <w:r>
-              <w:rPr>
-                <w:color w:val="1F2937"/>
-                <w:sz w:val="18"/>
-              </w:rPr>
-              <w:t>Hak penggunaan seumur hidup tanpa biaya sewa SaaS. Bebas tanpa batasan jumlah cabang, toko, user kasir, maupun volume transaksi.</w:t>
-            </w:r>
-          </w:p>
-        </w:tc>
-        <w:tc>
-          <w:tcPr>
-            <w:tcW w:type="dxa" w:w="3120"/>
-            <w:shd w:fill="FFFFFF"/>
-            <w:tcMar>
-              <w:top w:w="110" w:type="dxa"/>
-              <w:bottom w:w="110" w:type="dxa"/>
-              <w:left w:w="130" w:type="dxa"/>
-              <w:right w:w="130" w:type="dxa"/>
-            </w:tcMar>
-          </w:tcPr>
-          <w:p>
-            <w:r>
-              <w:rPr>
-                <w:b/>
-                <w:color w:val="166534"/>
-                <w:sz w:val="18"/>
-              </w:rPr>
-              <w:t>Termasuk (Hak Milik Penuh)</w:t>
-            </w:r>
-          </w:p>
-        </w:tc>
-      </w:tr>
-      <w:tr>
-        <w:tc>
-          <w:tcPr>
-            <w:tcW w:type="dxa" w:w="3120"/>
-            <w:shd w:fill="F9FAFB"/>
-            <w:tcMar>
-              <w:top w:w="110" w:type="dxa"/>
-              <w:bottom w:w="110" w:type="dxa"/>
-              <w:left w:w="130" w:type="dxa"/>
-              <w:right w:w="130" w:type="dxa"/>
-            </w:tcMar>
-          </w:tcPr>
-          <w:p>
-            <w:r>
-              <w:rPr>
-                <w:b/>
-                <w:color w:val="1E3A8A"/>
-                <w:sz w:val="18"/>
-              </w:rPr>
-              <w:t>2. Instalasi &amp; Deployment Server</w:t>
-            </w:r>
-          </w:p>
-        </w:tc>
-        <w:tc>
-          <w:tcPr>
-            <w:tcW w:type="dxa" w:w="3120"/>
-            <w:shd w:fill="F9FAFB"/>
-            <w:tcMar>
-              <w:top w:w="110" w:type="dxa"/>
-              <w:bottom w:w="110" w:type="dxa"/>
-              <w:left w:w="130" w:type="dxa"/>
-              <w:right w:w="130" w:type="dxa"/>
-            </w:tcMar>
-          </w:tcPr>
-          <w:p>
-            <w:r>
-              <w:rPr>
-                <w:color w:val="1F2937"/>
-                <w:sz w:val="18"/>
-              </w:rPr>
-              <w:t>Instalasi backend NestJS, database PostgreSQL 16, Redis, dan frontend React 19 di server kantor lokal (On-Premise) atau Private Cloud Klien.</w:t>
-            </w:r>
-          </w:p>
-        </w:tc>
-        <w:tc>
-          <w:tcPr>
-            <w:tcW w:type="dxa" w:w="3120"/>
-            <w:shd w:fill="F9FAFB"/>
-            <w:tcMar>
-              <w:top w:w="110" w:type="dxa"/>
-              <w:bottom w:w="110" w:type="dxa"/>
-              <w:left w:w="130" w:type="dxa"/>
-              <w:right w:w="130" w:type="dxa"/>
-            </w:tcMar>
-          </w:tcPr>
-          <w:p>
-            <w:r>
-              <w:rPr>
-                <w:b/>
-                <w:color w:val="166534"/>
-                <w:sz w:val="18"/>
-              </w:rPr>
-              <w:t>Termasuk (Siap Pakai)</w:t>
-            </w:r>
-          </w:p>
-        </w:tc>
-      </w:tr>
-      <w:tr>
-        <w:tc>
-          <w:tcPr>
-            <w:tcW w:type="dxa" w:w="3120"/>
-            <w:shd w:fill="FFFFFF"/>
-            <w:tcMar>
-              <w:top w:w="110" w:type="dxa"/>
-              <w:bottom w:w="110" w:type="dxa"/>
-              <w:left w:w="130" w:type="dxa"/>
-              <w:right w:w="130" w:type="dxa"/>
-            </w:tcMar>
-          </w:tcPr>
-          <w:p>
-            <w:r>
-              <w:rPr>
-                <w:b/>
-                <w:color w:val="1E3A8A"/>
-                <w:sz w:val="18"/>
-              </w:rPr>
-              <w:t>3. Setup Akuntansi &amp; Konfigurasi COA</w:t>
-            </w:r>
-          </w:p>
-        </w:tc>
-        <w:tc>
-          <w:tcPr>
-            <w:tcW w:type="dxa" w:w="3120"/>
-            <w:shd w:fill="FFFFFF"/>
-            <w:tcMar>
-              <w:top w:w="110" w:type="dxa"/>
-              <w:bottom w:w="110" w:type="dxa"/>
-              <w:left w:w="130" w:type="dxa"/>
-              <w:right w:w="130" w:type="dxa"/>
-            </w:tcMar>
-          </w:tcPr>
-          <w:p>
-            <w:r>
-              <w:rPr>
-                <w:color w:val="1F2937"/>
-                <w:sz w:val="18"/>
-              </w:rPr>
-              <w:t>Penyusunan Chart of Accounts standar, pengaturan saldo awal buku besar, akun kas/bank, dan konfigurasi aturan jurnal otomatis.</w:t>
-            </w:r>
-          </w:p>
-        </w:tc>
-        <w:tc>
-          <w:tcPr>
-            <w:tcW w:type="dxa" w:w="3120"/>
-            <w:shd w:fill="FFFFFF"/>
-            <w:tcMar>
-              <w:top w:w="110" w:type="dxa"/>
-              <w:bottom w:w="110" w:type="dxa"/>
-              <w:left w:w="130" w:type="dxa"/>
-              <w:right w:w="130" w:type="dxa"/>
-            </w:tcMar>
-          </w:tcPr>
-          <w:p>
-            <w:r>
-              <w:rPr>
-                <w:b/>
-                <w:color w:val="166534"/>
-                <w:sz w:val="18"/>
-              </w:rPr>
-              <w:t>Termasuk (Sesuai SOP Klien)</w:t>
-            </w:r>
-          </w:p>
-        </w:tc>
-      </w:tr>
-      <w:tr>
-        <w:tc>
-          <w:tcPr>
-            <w:tcW w:type="dxa" w:w="3120"/>
-            <w:shd w:fill="F9FAFB"/>
-            <w:tcMar>
-              <w:top w:w="110" w:type="dxa"/>
-              <w:bottom w:w="110" w:type="dxa"/>
-              <w:left w:w="130" w:type="dxa"/>
-              <w:right w:w="130" w:type="dxa"/>
-            </w:tcMar>
-          </w:tcPr>
-          <w:p>
-            <w:r>
-              <w:rPr>
-                <w:b/>
-                <w:color w:val="1E3A8A"/>
-                <w:sz w:val="18"/>
-              </w:rPr>
-              <w:t>4. Migrasi Data Master Bisnis</w:t>
-            </w:r>
-          </w:p>
-        </w:tc>
-        <w:tc>
-          <w:tcPr>
-            <w:tcW w:type="dxa" w:w="3120"/>
-            <w:shd w:fill="F9FAFB"/>
-            <w:tcMar>
-              <w:top w:w="110" w:type="dxa"/>
-              <w:bottom w:w="110" w:type="dxa"/>
-              <w:left w:w="130" w:type="dxa"/>
-              <w:right w:w="130" w:type="dxa"/>
-            </w:tcMar>
-          </w:tcPr>
-          <w:p>
-            <w:r>
-              <w:rPr>
-                <w:color w:val="1F2937"/>
-                <w:sz w:val="18"/>
-              </w:rPr>
-              <w:t>Import dan verifikasi data produk, barcode, harga jual, data pelanggan, supplier, serta saldo awal persediaan barang via template Excel.</w:t>
-            </w:r>
-          </w:p>
-        </w:tc>
-        <w:tc>
-          <w:tcPr>
-            <w:tcW w:type="dxa" w:w="3120"/>
-            <w:shd w:fill="F9FAFB"/>
-            <w:tcMar>
-              <w:top w:w="110" w:type="dxa"/>
-              <w:bottom w:w="110" w:type="dxa"/>
-              <w:left w:w="130" w:type="dxa"/>
-              <w:right w:w="130" w:type="dxa"/>
-            </w:tcMar>
-          </w:tcPr>
-          <w:p>
-            <w:r>
-              <w:rPr>
-                <w:b/>
-                <w:color w:val="166534"/>
-                <w:sz w:val="18"/>
-              </w:rPr>
-              <w:t>Termasuk (Tervalidasi)</w:t>
-            </w:r>
-          </w:p>
-        </w:tc>
-      </w:tr>
-      <w:tr>
-        <w:tc>
-          <w:tcPr>
-            <w:tcW w:type="dxa" w:w="3120"/>
-            <w:shd w:fill="FFFFFF"/>
-            <w:tcMar>
-              <w:top w:w="110" w:type="dxa"/>
-              <w:bottom w:w="110" w:type="dxa"/>
-              <w:left w:w="130" w:type="dxa"/>
-              <w:right w:w="130" w:type="dxa"/>
-            </w:tcMar>
-          </w:tcPr>
-          <w:p>
-            <w:r>
-              <w:rPr>
-                <w:b/>
-                <w:color w:val="1E3A8A"/>
-                <w:sz w:val="18"/>
-              </w:rPr>
-              <w:t>5. Pelatihan Staf (Training) &amp; UAT</w:t>
-            </w:r>
-          </w:p>
-        </w:tc>
-        <w:tc>
-          <w:tcPr>
-            <w:tcW w:type="dxa" w:w="3120"/>
-            <w:shd w:fill="FFFFFF"/>
-            <w:tcMar>
-              <w:top w:w="110" w:type="dxa"/>
-              <w:bottom w:w="110" w:type="dxa"/>
-              <w:left w:w="130" w:type="dxa"/>
-              <w:right w:w="130" w:type="dxa"/>
-            </w:tcMar>
-          </w:tcPr>
-          <w:p>
-            <w:r>
-              <w:rPr>
-                <w:color w:val="1F2937"/>
-                <w:sz w:val="18"/>
-              </w:rPr>
-              <w:t>Pelatihan langsung untuk seluruh staf kasir, tim gudang, purchasing, serta admin akuntansi hingga berita acara UAT ditandatangani.</w:t>
-            </w:r>
-          </w:p>
-        </w:tc>
-        <w:tc>
-          <w:tcPr>
-            <w:tcW w:type="dxa" w:w="3120"/>
-            <w:shd w:fill="FFFFFF"/>
-            <w:tcMar>
-              <w:top w:w="110" w:type="dxa"/>
-              <w:bottom w:w="110" w:type="dxa"/>
-              <w:left w:w="130" w:type="dxa"/>
-              <w:right w:w="130" w:type="dxa"/>
-            </w:tcMar>
-          </w:tcPr>
-          <w:p>
-            <w:r>
-              <w:rPr>
-                <w:b/>
-                <w:color w:val="166534"/>
-                <w:sz w:val="18"/>
-              </w:rPr>
-              <w:t>Termasuk (On-site / Online)</w:t>
-            </w:r>
-          </w:p>
-        </w:tc>
-      </w:tr>
-      <w:tr>
-        <w:tc>
-          <w:tcPr>
-            <w:tcW w:type="dxa" w:w="3120"/>
-            <w:shd w:fill="F9FAFB"/>
-            <w:tcMar>
-              <w:top w:w="110" w:type="dxa"/>
-              <w:bottom w:w="110" w:type="dxa"/>
-              <w:left w:w="130" w:type="dxa"/>
-              <w:right w:w="130" w:type="dxa"/>
-            </w:tcMar>
-          </w:tcPr>
-          <w:p>
-            <w:r>
-              <w:rPr>
-                <w:b/>
-                <w:color w:val="1E3A8A"/>
-                <w:sz w:val="18"/>
-              </w:rPr>
-              <w:t>6. Garansi Bebas Bug Awal (6 Bulan)</w:t>
-            </w:r>
-          </w:p>
-        </w:tc>
-        <w:tc>
-          <w:tcPr>
-            <w:tcW w:type="dxa" w:w="3120"/>
-            <w:shd w:fill="F9FAFB"/>
-            <w:tcMar>
-              <w:top w:w="110" w:type="dxa"/>
-              <w:bottom w:w="110" w:type="dxa"/>
-              <w:left w:w="130" w:type="dxa"/>
-              <w:right w:w="130" w:type="dxa"/>
-            </w:tcMar>
-          </w:tcPr>
-          <w:p>
-            <w:r>
-              <w:rPr>
-                <w:color w:val="1F2937"/>
-                <w:sz w:val="18"/>
-              </w:rPr>
-              <w:t>Garansi perbaikan bug teknis secara gratis selama 6 (enam) bulan penuh dan pendampingan operasional intensif pasca Go-Live.</w:t>
-            </w:r>
-          </w:p>
-        </w:tc>
-        <w:tc>
-          <w:tcPr>
-            <w:tcW w:type="dxa" w:w="3120"/>
-            <w:shd w:fill="F9FAFB"/>
-            <w:tcMar>
-              <w:top w:w="110" w:type="dxa"/>
-              <w:bottom w:w="110" w:type="dxa"/>
-              <w:left w:w="130" w:type="dxa"/>
-              <w:right w:w="130" w:type="dxa"/>
-            </w:tcMar>
-          </w:tcPr>
-          <w:p>
-            <w:r>
-              <w:rPr>
-                <w:b/>
-                <w:color w:val="166534"/>
-                <w:sz w:val="18"/>
-              </w:rPr>
-              <w:t>Termasuk (Gratis Rp 0,-)</w:t>
-            </w:r>
-          </w:p>
-        </w:tc>
-      </w:tr>
-    </w:tbl>
-    <w:p>
-      <w:pPr>
-        <w:spacing w:before="240" w:after="200"/>
-      </w:pPr>
-    </w:p>
-    <w:tbl>
-      <w:tblPr>
-        <w:tblW w:type="auto" w:w="0"/>
-        <w:jc w:val="center"/>
-        <w:tblLook w:firstColumn="1" w:firstRow="1" w:lastColumn="0" w:lastRow="0" w:noHBand="0" w:noVBand="1" w:val="04A0"/>
-      </w:tblPr>
-      <w:tblGrid>
-        <w:gridCol w:w="9360"/>
-      </w:tblGrid>
-      <w:tr>
-        <w:tc>
-          <w:tcPr>
-            <w:tcW w:type="dxa" w:w="9360"/>
-            <w:shd w:fill="EFF6FF"/>
-            <w:tcMar>
-              <w:top w:w="150" w:type="dxa"/>
-              <w:bottom w:w="150" w:type="dxa"/>
-              <w:left w:w="180" w:type="dxa"/>
-              <w:right w:w="180" w:type="dxa"/>
-            </w:tcMar>
-          </w:tcPr>
-          <w:p>
-            <w:r>
-              <w:rPr>
-                <w:b/>
-                <w:color w:val="1E3A8A"/>
-                <w:sz w:val="22"/>
-              </w:rPr>
-              <w:t>TOTAL NILAI INVESTASI LISENSI PENUH &amp; IMPLEMENTASI LENGKAP:</w:t>
+              <w:t>Paket ENTERPRISE</w:t>
               <w:br/>
-            </w:r>
-            <w:r>
-              <w:rPr>
-                <w:b/>
-                <w:color w:val="B45309"/>
-                <w:sz w:val="26"/>
-              </w:rPr>
-              <w:t>Rp 35.000.000,- s/d Rp 55.000.000,- (Sesuai Skala Operasional Klien)</w:t>
-              <w:br/>
-            </w:r>
-            <w:r>
-              <w:rPr>
-                <w:i/>
-                <w:color w:val="6B7280"/>
-                <w:sz w:val="18"/>
-              </w:rPr>
-              <w:t>*Catatan: Investasi satu kali bayar (one-time license fee). Bebas biaya sewa bulanan, bebas royalti per transaksi, dan bebas biaya pembukaan cabang baru di masa depan.</w:t>
-            </w:r>
-          </w:p>
-        </w:tc>
-      </w:tr>
-    </w:tbl>
-    <w:p>
-      <w:pPr>
-        <w:spacing w:before="160" w:after="80"/>
-      </w:pPr>
-      <w:r>
-        <w:rPr>
-          <w:b/>
-          <w:color w:val="1E3A8A"/>
-          <w:sz w:val="22"/>
-        </w:rPr>
-        <w:t>Tahapan Pembayaran Transparan (Term of Payment / TOP):</w:t>
-      </w:r>
-    </w:p>
-    <w:tbl>
-      <w:tblPr>
-        <w:tblW w:type="auto" w:w="0"/>
-        <w:jc w:val="center"/>
-        <w:tblLook w:firstColumn="1" w:firstRow="1" w:lastColumn="0" w:lastRow="0" w:noHBand="0" w:noVBand="1" w:val="04A0"/>
-      </w:tblPr>
-      <w:tblGrid>
-        <w:gridCol w:w="3120"/>
-        <w:gridCol w:w="3120"/>
-        <w:gridCol w:w="3120"/>
-      </w:tblGrid>
-      <w:tr>
-        <w:tc>
-          <w:tcPr>
-            <w:tcW w:type="dxa" w:w="3120"/>
-            <w:shd w:fill="1E3A8A"/>
-            <w:tcMar>
-              <w:top w:w="110" w:type="dxa"/>
-              <w:bottom w:w="110" w:type="dxa"/>
-              <w:left w:w="130" w:type="dxa"/>
-              <w:right w:w="130" w:type="dxa"/>
-            </w:tcMar>
-          </w:tcPr>
-          <w:p>
-            <w:r>
-              <w:rPr>
-                <w:b/>
-                <w:color w:val="FFFFFF"/>
-                <w:sz w:val="18"/>
-              </w:rPr>
-              <w:t>Tahap Pembayaran</w:t>
-            </w:r>
-          </w:p>
-        </w:tc>
-        <w:tc>
-          <w:tcPr>
-            <w:tcW w:type="dxa" w:w="3120"/>
-            <w:shd w:fill="1E3A8A"/>
-            <w:tcMar>
-              <w:top w:w="110" w:type="dxa"/>
-              <w:bottom w:w="110" w:type="dxa"/>
-              <w:left w:w="130" w:type="dxa"/>
-              <w:right w:w="130" w:type="dxa"/>
-            </w:tcMar>
-          </w:tcPr>
-          <w:p>
-            <w:r>
-              <w:rPr>
-                <w:b/>
-                <w:color w:val="FFFFFF"/>
-                <w:sz w:val="18"/>
-              </w:rPr>
-              <w:t>Persentase</w:t>
-            </w:r>
-          </w:p>
-        </w:tc>
-        <w:tc>
-          <w:tcPr>
-            <w:tcW w:type="dxa" w:w="3120"/>
-            <w:shd w:fill="1E3A8A"/>
-            <w:tcMar>
-              <w:top w:w="110" w:type="dxa"/>
-              <w:bottom w:w="110" w:type="dxa"/>
-              <w:left w:w="130" w:type="dxa"/>
-              <w:right w:w="130" w:type="dxa"/>
-            </w:tcMar>
-          </w:tcPr>
-          <w:p>
-            <w:r>
-              <w:rPr>
-                <w:b/>
-                <w:color w:val="FFFFFF"/>
-                <w:sz w:val="18"/>
-              </w:rPr>
-              <w:t>Kriteria Penagihan (Milestone Trigger)</w:t>
+              <w:t>(Multi-Cabang &amp; Rantai Pasok)</w:t>
             </w:r>
           </w:p>
         </w:tc>
@@ -2083,9 +910,9 @@
               <w:rPr>
                 <w:b/>
                 <w:color w:val="1E3A8A"/>
-                <w:sz w:val="18"/>
+                <w:sz w:val="17"/>
               </w:rPr>
-              <w:t>Tahap I (Uang Muka / DP)</w:t>
+              <w:t>Model Arsitektur Bisnis</w:t>
             </w:r>
           </w:p>
         </w:tc>
@@ -2101,13 +928,15 @@
             </w:tcMar>
           </w:tcPr>
           <w:p>
+            <w:pPr>
+              <w:jc w:val="center"/>
+            </w:pPr>
             <w:r>
               <w:rPr>
-                <w:b/>
-                <w:color w:val="0D9488"/>
-                <w:sz w:val="18"/>
+                <w:color w:val="1F2937"/>
+                <w:sz w:val="17"/>
               </w:rPr>
-              <w:t>40%</w:t>
+              <w:t>Toko Tunggal (Single-Store Architecture)</w:t>
             </w:r>
           </w:p>
         </w:tc>
@@ -2123,12 +952,16 @@
             </w:tcMar>
           </w:tcPr>
           <w:p>
+            <w:pPr>
+              <w:jc w:val="center"/>
+            </w:pPr>
             <w:r>
               <w:rPr>
-                <w:color w:val="1F2937"/>
-                <w:sz w:val="18"/>
+                <w:b/>
+                <w:color w:val="166534"/>
+                <w:sz w:val="17"/>
               </w:rPr>
-              <w:t>Dibayarkan saat penandatanganan lembar persetujuan proposal / kontrak implementasi sebelum instalasi dimulai.</w:t>
+              <w:t>Jaringan Multi-Cabang (Pusat HQ + Banyak Cabang)</w:t>
             </w:r>
           </w:p>
         </w:tc>
@@ -2150,9 +983,9 @@
               <w:rPr>
                 <w:b/>
                 <w:color w:val="1E3A8A"/>
-                <w:sz w:val="18"/>
+                <w:sz w:val="17"/>
               </w:rPr>
-              <w:t>Tahap II (Progress Setup &amp; Training)</w:t>
+              <w:t>Manajemen Gudang (Warehouse)</w:t>
             </w:r>
           </w:p>
         </w:tc>
@@ -2168,13 +1001,15 @@
             </w:tcMar>
           </w:tcPr>
           <w:p>
+            <w:pPr>
+              <w:jc w:val="center"/>
+            </w:pPr>
             <w:r>
               <w:rPr>
-                <w:b/>
-                <w:color w:val="0D9488"/>
-                <w:sz w:val="18"/>
+                <w:color w:val="1F2937"/>
+                <w:sz w:val="17"/>
               </w:rPr>
-              <w:t>40%</w:t>
+              <w:t>1 Gudang Toko Terpadu</w:t>
             </w:r>
           </w:p>
         </w:tc>
@@ -2190,12 +1025,16 @@
             </w:tcMar>
           </w:tcPr>
           <w:p>
+            <w:pPr>
+              <w:jc w:val="center"/>
+            </w:pPr>
             <w:r>
               <w:rPr>
-                <w:color w:val="1F2937"/>
-                <w:sz w:val="18"/>
+                <w:b/>
+                <w:color w:val="166534"/>
+                <w:sz w:val="17"/>
               </w:rPr>
-              <w:t>Dibayarkan setelah server berhasil diinstal, data master produk selesai dimigrasi, dan pelatihan staf kasir selesai.</w:t>
+              <w:t>Multi-Gudang (Gudang Pusat, Toko, &amp; Retur)</w:t>
             </w:r>
           </w:p>
         </w:tc>
@@ -2217,9 +1056,9 @@
               <w:rPr>
                 <w:b/>
                 <w:color w:val="1E3A8A"/>
-                <w:sz w:val="18"/>
+                <w:sz w:val="17"/>
               </w:rPr>
-              <w:t>Tahap III (Pelunasan Akhir)</w:t>
+              <w:t>Kasir POS &amp; Shift Laci Uang</w:t>
             </w:r>
           </w:p>
         </w:tc>
@@ -2235,13 +1074,15 @@
             </w:tcMar>
           </w:tcPr>
           <w:p>
+            <w:pPr>
+              <w:jc w:val="center"/>
+            </w:pPr>
             <w:r>
               <w:rPr>
-                <w:b/>
-                <w:color w:val="0D9488"/>
-                <w:sz w:val="18"/>
+                <w:color w:val="1F2937"/>
+                <w:sz w:val="17"/>
               </w:rPr>
-              <w:t>20%</w:t>
+              <w:t>✓ POS Cepat, Struk, Blind Count Shift</w:t>
             </w:r>
           </w:p>
         </w:tc>
@@ -2257,12 +1098,677 @@
             </w:tcMar>
           </w:tcPr>
           <w:p>
+            <w:pPr>
+              <w:jc w:val="center"/>
+            </w:pPr>
+            <w:r>
+              <w:rPr>
+                <w:b/>
+                <w:color w:val="166534"/>
+                <w:sz w:val="17"/>
+              </w:rPr>
+              <w:t>✓ POS Cepat, Struk, Blind Count Shift</w:t>
+            </w:r>
+          </w:p>
+        </w:tc>
+      </w:tr>
+      <w:tr>
+        <w:tc>
+          <w:tcPr>
+            <w:tcW w:type="dxa" w:w="3120"/>
+            <w:shd w:fill="F9FAFB"/>
+            <w:tcMar>
+              <w:top w:w="100" w:type="dxa"/>
+              <w:bottom w:w="100" w:type="dxa"/>
+              <w:left w:w="120" w:type="dxa"/>
+              <w:right w:w="120" w:type="dxa"/>
+            </w:tcMar>
+          </w:tcPr>
+          <w:p>
+            <w:r>
+              <w:rPr>
+                <w:b/>
+                <w:color w:val="1E3A8A"/>
+                <w:sz w:val="17"/>
+              </w:rPr>
+              <w:t>Proteksi Kebocoran Kasir</w:t>
+            </w:r>
+          </w:p>
+        </w:tc>
+        <w:tc>
+          <w:tcPr>
+            <w:tcW w:type="dxa" w:w="3120"/>
+            <w:shd w:fill="F9FAFB"/>
+            <w:tcMar>
+              <w:top w:w="100" w:type="dxa"/>
+              <w:bottom w:w="100" w:type="dxa"/>
+              <w:left w:w="120" w:type="dxa"/>
+              <w:right w:w="120" w:type="dxa"/>
+            </w:tcMar>
+          </w:tcPr>
+          <w:p>
+            <w:pPr>
+              <w:jc w:val="center"/>
+            </w:pPr>
             <w:r>
               <w:rPr>
                 <w:color w:val="1F2937"/>
-                <w:sz w:val="18"/>
+                <w:sz w:val="17"/>
               </w:rPr>
-              <w:t>Dibayarkan saat sistem resmi beroperasi melayani transaksi nyata (Go-Live) dan penandatanganan Berita Acara Serah Terima (BAST).</w:t>
+              <w:t>✓ Batasan Akses Kasir Standar</w:t>
+            </w:r>
+          </w:p>
+        </w:tc>
+        <w:tc>
+          <w:tcPr>
+            <w:tcW w:type="dxa" w:w="3120"/>
+            <w:shd w:fill="F9FAFB"/>
+            <w:tcMar>
+              <w:top w:w="100" w:type="dxa"/>
+              <w:bottom w:w="100" w:type="dxa"/>
+              <w:left w:w="120" w:type="dxa"/>
+              <w:right w:w="120" w:type="dxa"/>
+            </w:tcMar>
+          </w:tcPr>
+          <w:p>
+            <w:pPr>
+              <w:jc w:val="center"/>
+            </w:pPr>
+            <w:r>
+              <w:rPr>
+                <w:b/>
+                <w:color w:val="166534"/>
+                <w:sz w:val="17"/>
+              </w:rPr>
+              <w:t>✓ Otorisasi Void Khusus Supervisor &amp; Limit Diskon</w:t>
+            </w:r>
+          </w:p>
+        </w:tc>
+      </w:tr>
+      <w:tr>
+        <w:tc>
+          <w:tcPr>
+            <w:tcW w:type="dxa" w:w="3120"/>
+            <w:shd w:fill="FFFFFF"/>
+            <w:tcMar>
+              <w:top w:w="100" w:type="dxa"/>
+              <w:bottom w:w="100" w:type="dxa"/>
+              <w:left w:w="120" w:type="dxa"/>
+              <w:right w:w="120" w:type="dxa"/>
+            </w:tcMar>
+          </w:tcPr>
+          <w:p>
+            <w:r>
+              <w:rPr>
+                <w:b/>
+                <w:color w:val="1E3A8A"/>
+                <w:sz w:val="17"/>
+              </w:rPr>
+              <w:t>Manajemen Persediaan &amp; Stok</w:t>
+            </w:r>
+          </w:p>
+        </w:tc>
+        <w:tc>
+          <w:tcPr>
+            <w:tcW w:type="dxa" w:w="3120"/>
+            <w:shd w:fill="FFFFFF"/>
+            <w:tcMar>
+              <w:top w:w="100" w:type="dxa"/>
+              <w:bottom w:w="100" w:type="dxa"/>
+              <w:left w:w="120" w:type="dxa"/>
+              <w:right w:w="120" w:type="dxa"/>
+            </w:tcMar>
+          </w:tcPr>
+          <w:p>
+            <w:pPr>
+              <w:jc w:val="center"/>
+            </w:pPr>
+            <w:r>
+              <w:rPr>
+                <w:color w:val="1F2937"/>
+                <w:sz w:val="17"/>
+              </w:rPr>
+              <w:t>✓ Kartu Stok, Opname, Alert Minimum</w:t>
+            </w:r>
+          </w:p>
+        </w:tc>
+        <w:tc>
+          <w:tcPr>
+            <w:tcW w:type="dxa" w:w="3120"/>
+            <w:shd w:fill="FFFFFF"/>
+            <w:tcMar>
+              <w:top w:w="100" w:type="dxa"/>
+              <w:bottom w:w="100" w:type="dxa"/>
+              <w:left w:w="120" w:type="dxa"/>
+              <w:right w:w="120" w:type="dxa"/>
+            </w:tcMar>
+          </w:tcPr>
+          <w:p>
+            <w:pPr>
+              <w:jc w:val="center"/>
+            </w:pPr>
+            <w:r>
+              <w:rPr>
+                <w:b/>
+                <w:color w:val="166534"/>
+                <w:sz w:val="17"/>
+              </w:rPr>
+              <w:t>✓ Kartu Stok, Opname, + Transfer Antar Toko (DO)</w:t>
+            </w:r>
+          </w:p>
+        </w:tc>
+      </w:tr>
+      <w:tr>
+        <w:tc>
+          <w:tcPr>
+            <w:tcW w:type="dxa" w:w="3120"/>
+            <w:shd w:fill="F9FAFB"/>
+            <w:tcMar>
+              <w:top w:w="100" w:type="dxa"/>
+              <w:bottom w:w="100" w:type="dxa"/>
+              <w:left w:w="120" w:type="dxa"/>
+              <w:right w:w="120" w:type="dxa"/>
+            </w:tcMar>
+          </w:tcPr>
+          <w:p>
+            <w:r>
+              <w:rPr>
+                <w:b/>
+                <w:color w:val="1E3A8A"/>
+                <w:sz w:val="17"/>
+              </w:rPr>
+              <w:t>Proteksi Stok Anti-Minus</w:t>
+            </w:r>
+          </w:p>
+        </w:tc>
+        <w:tc>
+          <w:tcPr>
+            <w:tcW w:type="dxa" w:w="3120"/>
+            <w:shd w:fill="F9FAFB"/>
+            <w:tcMar>
+              <w:top w:w="100" w:type="dxa"/>
+              <w:bottom w:w="100" w:type="dxa"/>
+              <w:left w:w="120" w:type="dxa"/>
+              <w:right w:w="120" w:type="dxa"/>
+            </w:tcMar>
+          </w:tcPr>
+          <w:p>
+            <w:pPr>
+              <w:jc w:val="center"/>
+            </w:pPr>
+            <w:r>
+              <w:rPr>
+                <w:color w:val="1F2937"/>
+                <w:sz w:val="17"/>
+              </w:rPr>
+              <w:t>Peringatan Stok Sistem</w:t>
+            </w:r>
+          </w:p>
+        </w:tc>
+        <w:tc>
+          <w:tcPr>
+            <w:tcW w:type="dxa" w:w="3120"/>
+            <w:shd w:fill="F9FAFB"/>
+            <w:tcMar>
+              <w:top w:w="100" w:type="dxa"/>
+              <w:bottom w:w="100" w:type="dxa"/>
+              <w:left w:w="120" w:type="dxa"/>
+              <w:right w:w="120" w:type="dxa"/>
+            </w:tcMar>
+          </w:tcPr>
+          <w:p>
+            <w:pPr>
+              <w:jc w:val="center"/>
+            </w:pPr>
+            <w:r>
+              <w:rPr>
+                <w:b/>
+                <w:color w:val="166534"/>
+                <w:sz w:val="17"/>
+              </w:rPr>
+              <w:t>✓ Row-Level Database Lock (Anti-Overselling)</w:t>
+            </w:r>
+          </w:p>
+        </w:tc>
+      </w:tr>
+      <w:tr>
+        <w:tc>
+          <w:tcPr>
+            <w:tcW w:type="dxa" w:w="3120"/>
+            <w:shd w:fill="FFFFFF"/>
+            <w:tcMar>
+              <w:top w:w="100" w:type="dxa"/>
+              <w:bottom w:w="100" w:type="dxa"/>
+              <w:left w:w="120" w:type="dxa"/>
+              <w:right w:w="120" w:type="dxa"/>
+            </w:tcMar>
+          </w:tcPr>
+          <w:p>
+            <w:r>
+              <w:rPr>
+                <w:b/>
+                <w:color w:val="1E3A8A"/>
+                <w:sz w:val="17"/>
+              </w:rPr>
+              <w:t>Pengadaan &amp; Pembelian (Purchasing)</w:t>
+            </w:r>
+          </w:p>
+        </w:tc>
+        <w:tc>
+          <w:tcPr>
+            <w:tcW w:type="dxa" w:w="3120"/>
+            <w:shd w:fill="FFFFFF"/>
+            <w:tcMar>
+              <w:top w:w="100" w:type="dxa"/>
+              <w:bottom w:w="100" w:type="dxa"/>
+              <w:left w:w="120" w:type="dxa"/>
+              <w:right w:w="120" w:type="dxa"/>
+            </w:tcMar>
+          </w:tcPr>
+          <w:p>
+            <w:pPr>
+              <w:jc w:val="center"/>
+            </w:pPr>
+            <w:r>
+              <w:rPr>
+                <w:color w:val="1F2937"/>
+                <w:sz w:val="17"/>
+              </w:rPr>
+              <w:t>Pencatatan Pembelian &amp; Faktur Supplier</w:t>
+            </w:r>
+          </w:p>
+        </w:tc>
+        <w:tc>
+          <w:tcPr>
+            <w:tcW w:type="dxa" w:w="3120"/>
+            <w:shd w:fill="FFFFFF"/>
+            <w:tcMar>
+              <w:top w:w="100" w:type="dxa"/>
+              <w:bottom w:w="100" w:type="dxa"/>
+              <w:left w:w="120" w:type="dxa"/>
+              <w:right w:w="120" w:type="dxa"/>
+            </w:tcMar>
+          </w:tcPr>
+          <w:p>
+            <w:pPr>
+              <w:jc w:val="center"/>
+            </w:pPr>
+            <w:r>
+              <w:rPr>
+                <w:b/>
+                <w:color w:val="166534"/>
+                <w:sz w:val="17"/>
+              </w:rPr>
+              <w:t>✓ Siklus Lengkap (PR ➔ PO ➔ Goods Receipt ➔ Retur)</w:t>
+            </w:r>
+          </w:p>
+        </w:tc>
+      </w:tr>
+      <w:tr>
+        <w:tc>
+          <w:tcPr>
+            <w:tcW w:type="dxa" w:w="3120"/>
+            <w:shd w:fill="F9FAFB"/>
+            <w:tcMar>
+              <w:top w:w="100" w:type="dxa"/>
+              <w:bottom w:w="100" w:type="dxa"/>
+              <w:left w:w="120" w:type="dxa"/>
+              <w:right w:w="120" w:type="dxa"/>
+            </w:tcMar>
+          </w:tcPr>
+          <w:p>
+            <w:r>
+              <w:rPr>
+                <w:b/>
+                <w:color w:val="1E3A8A"/>
+                <w:sz w:val="17"/>
+              </w:rPr>
+              <w:t>Penjualan B2B &amp; Daftar Harga</w:t>
+            </w:r>
+          </w:p>
+        </w:tc>
+        <w:tc>
+          <w:tcPr>
+            <w:tcW w:type="dxa" w:w="3120"/>
+            <w:shd w:fill="F9FAFB"/>
+            <w:tcMar>
+              <w:top w:w="100" w:type="dxa"/>
+              <w:bottom w:w="100" w:type="dxa"/>
+              <w:left w:w="120" w:type="dxa"/>
+              <w:right w:w="120" w:type="dxa"/>
+            </w:tcMar>
+          </w:tcPr>
+          <w:p>
+            <w:pPr>
+              <w:jc w:val="center"/>
+            </w:pPr>
+            <w:r>
+              <w:rPr>
+                <w:color w:val="1F2937"/>
+                <w:sz w:val="17"/>
+              </w:rPr>
+              <w:t>Penjualan Kasir Retail</w:t>
+            </w:r>
+          </w:p>
+        </w:tc>
+        <w:tc>
+          <w:tcPr>
+            <w:tcW w:type="dxa" w:w="3120"/>
+            <w:shd w:fill="F9FAFB"/>
+            <w:tcMar>
+              <w:top w:w="100" w:type="dxa"/>
+              <w:bottom w:w="100" w:type="dxa"/>
+              <w:left w:w="120" w:type="dxa"/>
+              <w:right w:w="120" w:type="dxa"/>
+            </w:tcMar>
+          </w:tcPr>
+          <w:p>
+            <w:pPr>
+              <w:jc w:val="center"/>
+            </w:pPr>
+            <w:r>
+              <w:rPr>
+                <w:b/>
+                <w:color w:val="166534"/>
+                <w:sz w:val="17"/>
+              </w:rPr>
+              <w:t>✓ B2B Sales Order, DO, &amp; Price List (Retail/Grosir/VIP)</w:t>
+            </w:r>
+          </w:p>
+        </w:tc>
+      </w:tr>
+      <w:tr>
+        <w:tc>
+          <w:tcPr>
+            <w:tcW w:type="dxa" w:w="3120"/>
+            <w:shd w:fill="FFFFFF"/>
+            <w:tcMar>
+              <w:top w:w="100" w:type="dxa"/>
+              <w:bottom w:w="100" w:type="dxa"/>
+              <w:left w:w="120" w:type="dxa"/>
+              <w:right w:w="120" w:type="dxa"/>
+            </w:tcMar>
+          </w:tcPr>
+          <w:p>
+            <w:r>
+              <w:rPr>
+                <w:b/>
+                <w:color w:val="1E3A8A"/>
+                <w:sz w:val="17"/>
+              </w:rPr>
+              <w:t>Modul Akuntansi &amp; Laporan Keuangan</w:t>
+            </w:r>
+          </w:p>
+        </w:tc>
+        <w:tc>
+          <w:tcPr>
+            <w:tcW w:type="dxa" w:w="3120"/>
+            <w:shd w:fill="FFFFFF"/>
+            <w:tcMar>
+              <w:top w:w="100" w:type="dxa"/>
+              <w:bottom w:w="100" w:type="dxa"/>
+              <w:left w:w="120" w:type="dxa"/>
+              <w:right w:w="120" w:type="dxa"/>
+            </w:tcMar>
+          </w:tcPr>
+          <w:p>
+            <w:pPr>
+              <w:jc w:val="center"/>
+            </w:pPr>
+            <w:r>
+              <w:rPr>
+                <w:color w:val="1F2937"/>
+                <w:sz w:val="17"/>
+              </w:rPr>
+              <w:t>Rekap Kas Harian &amp; Laba Kotor Toko</w:t>
+            </w:r>
+          </w:p>
+        </w:tc>
+        <w:tc>
+          <w:tcPr>
+            <w:tcW w:type="dxa" w:w="3120"/>
+            <w:shd w:fill="FFFFFF"/>
+            <w:tcMar>
+              <w:top w:w="100" w:type="dxa"/>
+              <w:bottom w:w="100" w:type="dxa"/>
+              <w:left w:w="120" w:type="dxa"/>
+              <w:right w:w="120" w:type="dxa"/>
+            </w:tcMar>
+          </w:tcPr>
+          <w:p>
+            <w:pPr>
+              <w:jc w:val="center"/>
+            </w:pPr>
+            <w:r>
+              <w:rPr>
+                <w:b/>
+                <w:color w:val="166534"/>
+                <w:sz w:val="17"/>
+              </w:rPr>
+              <w:t>✓ Full General Ledger, COA Standar, Laba Rugi &amp; Neraca SAK</w:t>
+            </w:r>
+          </w:p>
+        </w:tc>
+      </w:tr>
+      <w:tr>
+        <w:tc>
+          <w:tcPr>
+            <w:tcW w:type="dxa" w:w="3120"/>
+            <w:shd w:fill="F9FAFB"/>
+            <w:tcMar>
+              <w:top w:w="100" w:type="dxa"/>
+              <w:bottom w:w="100" w:type="dxa"/>
+              <w:left w:w="120" w:type="dxa"/>
+              <w:right w:w="120" w:type="dxa"/>
+            </w:tcMar>
+          </w:tcPr>
+          <w:p>
+            <w:r>
+              <w:rPr>
+                <w:b/>
+                <w:color w:val="1E3A8A"/>
+                <w:sz w:val="17"/>
+              </w:rPr>
+              <w:t>Rekonsiliasi Bank &amp; Umur Piutang</w:t>
+            </w:r>
+          </w:p>
+        </w:tc>
+        <w:tc>
+          <w:tcPr>
+            <w:tcW w:type="dxa" w:w="3120"/>
+            <w:shd w:fill="F9FAFB"/>
+            <w:tcMar>
+              <w:top w:w="100" w:type="dxa"/>
+              <w:bottom w:w="100" w:type="dxa"/>
+              <w:left w:w="120" w:type="dxa"/>
+              <w:right w:w="120" w:type="dxa"/>
+            </w:tcMar>
+          </w:tcPr>
+          <w:p>
+            <w:pPr>
+              <w:jc w:val="center"/>
+            </w:pPr>
+            <w:r>
+              <w:rPr>
+                <w:color w:val="1F2937"/>
+                <w:sz w:val="17"/>
+              </w:rPr>
+              <w:t>Pencatatan Transfer Manual</w:t>
+            </w:r>
+          </w:p>
+        </w:tc>
+        <w:tc>
+          <w:tcPr>
+            <w:tcW w:type="dxa" w:w="3120"/>
+            <w:shd w:fill="F9FAFB"/>
+            <w:tcMar>
+              <w:top w:w="100" w:type="dxa"/>
+              <w:bottom w:w="100" w:type="dxa"/>
+              <w:left w:w="120" w:type="dxa"/>
+              <w:right w:w="120" w:type="dxa"/>
+            </w:tcMar>
+          </w:tcPr>
+          <w:p>
+            <w:pPr>
+              <w:jc w:val="center"/>
+            </w:pPr>
+            <w:r>
+              <w:rPr>
+                <w:b/>
+                <w:color w:val="166534"/>
+                <w:sz w:val="17"/>
+              </w:rPr>
+              <w:t>✓ Rekonsiliasi Bank Otomatis &amp; AR/AP Aging Schedule</w:t>
+            </w:r>
+          </w:p>
+        </w:tc>
+      </w:tr>
+      <w:tr>
+        <w:tc>
+          <w:tcPr>
+            <w:tcW w:type="dxa" w:w="3120"/>
+            <w:shd w:fill="FFFFFF"/>
+            <w:tcMar>
+              <w:top w:w="100" w:type="dxa"/>
+              <w:bottom w:w="100" w:type="dxa"/>
+              <w:left w:w="120" w:type="dxa"/>
+              <w:right w:w="120" w:type="dxa"/>
+            </w:tcMar>
+          </w:tcPr>
+          <w:p>
+            <w:r>
+              <w:rPr>
+                <w:b/>
+                <w:color w:val="1E3A8A"/>
+                <w:sz w:val="17"/>
+              </w:rPr>
+              <w:t>Kapasitas Pengguna &amp; Lisensi User</w:t>
+            </w:r>
+          </w:p>
+        </w:tc>
+        <w:tc>
+          <w:tcPr>
+            <w:tcW w:type="dxa" w:w="3120"/>
+            <w:shd w:fill="FFFFFF"/>
+            <w:tcMar>
+              <w:top w:w="100" w:type="dxa"/>
+              <w:bottom w:w="100" w:type="dxa"/>
+              <w:left w:w="120" w:type="dxa"/>
+              <w:right w:w="120" w:type="dxa"/>
+            </w:tcMar>
+          </w:tcPr>
+          <w:p>
+            <w:pPr>
+              <w:jc w:val="center"/>
+            </w:pPr>
+            <w:r>
+              <w:rPr>
+                <w:color w:val="1F2937"/>
+                <w:sz w:val="17"/>
+              </w:rPr>
+              <w:t>Tanpa Biaya per User (Bebas buat user toko)</w:t>
+              <w:br/>
+              <w:t>Disiapkan untuk tim kasir &amp; pengelola toko</w:t>
+            </w:r>
+          </w:p>
+        </w:tc>
+        <w:tc>
+          <w:tcPr>
+            <w:tcW w:type="dxa" w:w="3120"/>
+            <w:shd w:fill="FFFFFF"/>
+            <w:tcMar>
+              <w:top w:w="100" w:type="dxa"/>
+              <w:bottom w:w="100" w:type="dxa"/>
+              <w:left w:w="120" w:type="dxa"/>
+              <w:right w:w="120" w:type="dxa"/>
+            </w:tcMar>
+          </w:tcPr>
+          <w:p>
+            <w:pPr>
+              <w:jc w:val="center"/>
+            </w:pPr>
+            <w:r>
+              <w:rPr>
+                <w:b/>
+                <w:color w:val="166534"/>
+                <w:sz w:val="17"/>
+              </w:rPr>
+              <w:t>Tanpa Biaya per User &amp; Cabang (Bebas ekspansi)</w:t>
+              <w:br/>
+              <w:t>Dilengkapi 10+ Hak Akses Berjenjang antar divisi</w:t>
+            </w:r>
+          </w:p>
+        </w:tc>
+      </w:tr>
+      <w:tr>
+        <w:tc>
+          <w:tcPr>
+            <w:tcW w:type="dxa" w:w="3120"/>
+            <w:shd w:fill="F9FAFB"/>
+            <w:tcMar>
+              <w:top w:w="100" w:type="dxa"/>
+              <w:bottom w:w="100" w:type="dxa"/>
+              <w:left w:w="120" w:type="dxa"/>
+              <w:right w:w="120" w:type="dxa"/>
+            </w:tcMar>
+          </w:tcPr>
+          <w:p>
+            <w:r>
+              <w:rPr>
+                <w:b/>
+                <w:color w:val="1E3A8A"/>
+                <w:sz w:val="17"/>
+              </w:rPr>
+              <w:t>Garansi &amp; Pendampingan Purna Jual</w:t>
+            </w:r>
+          </w:p>
+        </w:tc>
+        <w:tc>
+          <w:tcPr>
+            <w:tcW w:type="dxa" w:w="3120"/>
+            <w:shd w:fill="F9FAFB"/>
+            <w:tcMar>
+              <w:top w:w="100" w:type="dxa"/>
+              <w:bottom w:w="100" w:type="dxa"/>
+              <w:left w:w="120" w:type="dxa"/>
+              <w:right w:w="120" w:type="dxa"/>
+            </w:tcMar>
+          </w:tcPr>
+          <w:p>
+            <w:pPr>
+              <w:jc w:val="center"/>
+            </w:pPr>
+            <w:r>
+              <w:rPr>
+                <w:color w:val="1F2937"/>
+                <w:sz w:val="17"/>
+              </w:rPr>
+              <w:t>Garansi Bebas Bug 3 Bulan</w:t>
+            </w:r>
+          </w:p>
+        </w:tc>
+        <w:tc>
+          <w:tcPr>
+            <w:tcW w:type="dxa" w:w="3120"/>
+            <w:shd w:fill="F9FAFB"/>
+            <w:tcMar>
+              <w:top w:w="100" w:type="dxa"/>
+              <w:bottom w:w="100" w:type="dxa"/>
+              <w:left w:w="120" w:type="dxa"/>
+              <w:right w:w="120" w:type="dxa"/>
+            </w:tcMar>
+          </w:tcPr>
+          <w:p>
+            <w:pPr>
+              <w:jc w:val="center"/>
+            </w:pPr>
+            <w:r>
+              <w:rPr>
+                <w:b/>
+                <w:color w:val="166534"/>
+                <w:sz w:val="17"/>
+              </w:rPr>
+              <w:t>Garansi Bebas Bug 6 Bulan + SLA Prioritas &lt; 1 Jam</w:t>
             </w:r>
           </w:p>
         </w:tc>
@@ -2279,460 +1785,93 @@
           <w:color w:val="1E3A8A"/>
           <w:sz w:val="32"/>
         </w:rPr>
-        <w:t>6. Jadwal Kerja &amp; Roadmap Implementasi (4 Minggu)</w:t>
+        <w:t>4. Manfaat Operasional Riil bagi Manajemen Bisnis</w:t>
       </w:r>
     </w:p>
-    <w:tbl>
-      <w:tblPr>
-        <w:tblW w:type="auto" w:w="0"/>
-        <w:jc w:val="center"/>
-        <w:tblLook w:firstColumn="1" w:firstRow="1" w:lastColumn="0" w:lastRow="0" w:noHBand="0" w:noVBand="1" w:val="04A0"/>
-      </w:tblPr>
-      <w:tblGrid>
-        <w:gridCol w:w="2340"/>
-        <w:gridCol w:w="2340"/>
-        <w:gridCol w:w="2340"/>
-        <w:gridCol w:w="2340"/>
-      </w:tblGrid>
-      <w:tr>
-        <w:tc>
-          <w:tcPr>
-            <w:tcW w:type="dxa" w:w="2340"/>
-            <w:shd w:fill="1E3A8A"/>
-            <w:tcMar>
-              <w:top w:w="120" w:type="dxa"/>
-              <w:bottom w:w="120" w:type="dxa"/>
-              <w:left w:w="140" w:type="dxa"/>
-              <w:right w:w="140" w:type="dxa"/>
-            </w:tcMar>
-          </w:tcPr>
-          <w:p>
-            <w:r>
-              <w:rPr>
-                <w:b/>
-                <w:color w:val="FFFFFF"/>
-                <w:sz w:val="19"/>
-              </w:rPr>
-              <w:t>Tahapan Milestone</w:t>
-            </w:r>
-          </w:p>
-        </w:tc>
-        <w:tc>
-          <w:tcPr>
-            <w:tcW w:type="dxa" w:w="2340"/>
-            <w:shd w:fill="1E3A8A"/>
-            <w:tcMar>
-              <w:top w:w="120" w:type="dxa"/>
-              <w:bottom w:w="120" w:type="dxa"/>
-              <w:left w:w="140" w:type="dxa"/>
-              <w:right w:w="140" w:type="dxa"/>
-            </w:tcMar>
-          </w:tcPr>
-          <w:p>
-            <w:r>
-              <w:rPr>
-                <w:b/>
-                <w:color w:val="FFFFFF"/>
-                <w:sz w:val="19"/>
-              </w:rPr>
-              <w:t>Durasi</w:t>
-            </w:r>
-          </w:p>
-        </w:tc>
-        <w:tc>
-          <w:tcPr>
-            <w:tcW w:type="dxa" w:w="2340"/>
-            <w:shd w:fill="1E3A8A"/>
-            <w:tcMar>
-              <w:top w:w="120" w:type="dxa"/>
-              <w:bottom w:w="120" w:type="dxa"/>
-              <w:left w:w="140" w:type="dxa"/>
-              <w:right w:w="140" w:type="dxa"/>
-            </w:tcMar>
-          </w:tcPr>
-          <w:p>
-            <w:r>
-              <w:rPr>
-                <w:b/>
-                <w:color w:val="FFFFFF"/>
-                <w:sz w:val="19"/>
-              </w:rPr>
-              <w:t>Aktivitas Utama</w:t>
-            </w:r>
-          </w:p>
-        </w:tc>
-        <w:tc>
-          <w:tcPr>
-            <w:tcW w:type="dxa" w:w="2340"/>
-            <w:shd w:fill="1E3A8A"/>
-            <w:tcMar>
-              <w:top w:w="120" w:type="dxa"/>
-              <w:bottom w:w="120" w:type="dxa"/>
-              <w:left w:w="140" w:type="dxa"/>
-              <w:right w:w="140" w:type="dxa"/>
-            </w:tcMar>
-          </w:tcPr>
-          <w:p>
-            <w:r>
-              <w:rPr>
-                <w:b/>
-                <w:color w:val="FFFFFF"/>
-                <w:sz w:val="19"/>
-              </w:rPr>
-              <w:t>Hasil Nyata (Deliverable)</w:t>
-            </w:r>
-          </w:p>
-        </w:tc>
-      </w:tr>
-      <w:tr>
-        <w:tc>
-          <w:tcPr>
-            <w:tcW w:type="dxa" w:w="2340"/>
-            <w:shd w:fill="FFFFFF"/>
-            <w:tcMar>
-              <w:top w:w="100" w:type="dxa"/>
-              <w:bottom w:w="100" w:type="dxa"/>
-              <w:left w:w="120" w:type="dxa"/>
-              <w:right w:w="120" w:type="dxa"/>
-            </w:tcMar>
-          </w:tcPr>
-          <w:p>
-            <w:r>
-              <w:rPr>
-                <w:b/>
-                <w:color w:val="1E3A8A"/>
-                <w:sz w:val="18"/>
-              </w:rPr>
-              <w:t>Tahap 1: Setup Server &amp; COA</w:t>
-            </w:r>
-          </w:p>
-        </w:tc>
-        <w:tc>
-          <w:tcPr>
-            <w:tcW w:type="dxa" w:w="2340"/>
-            <w:shd w:fill="FFFFFF"/>
-            <w:tcMar>
-              <w:top w:w="100" w:type="dxa"/>
-              <w:bottom w:w="100" w:type="dxa"/>
-              <w:left w:w="120" w:type="dxa"/>
-              <w:right w:w="120" w:type="dxa"/>
-            </w:tcMar>
-          </w:tcPr>
-          <w:p>
-            <w:r>
-              <w:rPr>
-                <w:color w:val="1F2937"/>
-                <w:sz w:val="18"/>
-              </w:rPr>
-              <w:t>Minggu 1</w:t>
-            </w:r>
-          </w:p>
-        </w:tc>
-        <w:tc>
-          <w:tcPr>
-            <w:tcW w:type="dxa" w:w="2340"/>
-            <w:shd w:fill="FFFFFF"/>
-            <w:tcMar>
-              <w:top w:w="100" w:type="dxa"/>
-              <w:bottom w:w="100" w:type="dxa"/>
-              <w:left w:w="120" w:type="dxa"/>
-              <w:right w:w="120" w:type="dxa"/>
-            </w:tcMar>
-          </w:tcPr>
-          <w:p>
-            <w:r>
-              <w:rPr>
-                <w:color w:val="1F2937"/>
-                <w:sz w:val="18"/>
-              </w:rPr>
-              <w:t>Pemasangan sistem di server klien, konfigurasi database, dan setup Chart of Accounts.</w:t>
-            </w:r>
-          </w:p>
-        </w:tc>
-        <w:tc>
-          <w:tcPr>
-            <w:tcW w:type="dxa" w:w="2340"/>
-            <w:shd w:fill="FFFFFF"/>
-            <w:tcMar>
-              <w:top w:w="100" w:type="dxa"/>
-              <w:bottom w:w="100" w:type="dxa"/>
-              <w:left w:w="120" w:type="dxa"/>
-              <w:right w:w="120" w:type="dxa"/>
-            </w:tcMar>
-          </w:tcPr>
-          <w:p>
-            <w:r>
-              <w:rPr>
-                <w:color w:val="1F2937"/>
-                <w:sz w:val="18"/>
-              </w:rPr>
-              <w:t>Server Siap &amp; Lingkungan Terkonfigurasi</w:t>
-            </w:r>
-          </w:p>
-        </w:tc>
-      </w:tr>
-      <w:tr>
-        <w:tc>
-          <w:tcPr>
-            <w:tcW w:type="dxa" w:w="2340"/>
-            <w:shd w:fill="F9FAFB"/>
-            <w:tcMar>
-              <w:top w:w="100" w:type="dxa"/>
-              <w:bottom w:w="100" w:type="dxa"/>
-              <w:left w:w="120" w:type="dxa"/>
-              <w:right w:w="120" w:type="dxa"/>
-            </w:tcMar>
-          </w:tcPr>
-          <w:p>
-            <w:r>
-              <w:rPr>
-                <w:b/>
-                <w:color w:val="1E3A8A"/>
-                <w:sz w:val="18"/>
-              </w:rPr>
-              <w:t>Tahap 2: Migrasi Data Master</w:t>
-            </w:r>
-          </w:p>
-        </w:tc>
-        <w:tc>
-          <w:tcPr>
-            <w:tcW w:type="dxa" w:w="2340"/>
-            <w:shd w:fill="F9FAFB"/>
-            <w:tcMar>
-              <w:top w:w="100" w:type="dxa"/>
-              <w:bottom w:w="100" w:type="dxa"/>
-              <w:left w:w="120" w:type="dxa"/>
-              <w:right w:w="120" w:type="dxa"/>
-            </w:tcMar>
-          </w:tcPr>
-          <w:p>
-            <w:r>
-              <w:rPr>
-                <w:color w:val="1F2937"/>
-                <w:sz w:val="18"/>
-              </w:rPr>
-              <w:t>Minggu 2</w:t>
-            </w:r>
-          </w:p>
-        </w:tc>
-        <w:tc>
-          <w:tcPr>
-            <w:tcW w:type="dxa" w:w="2340"/>
-            <w:shd w:fill="F9FAFB"/>
-            <w:tcMar>
-              <w:top w:w="100" w:type="dxa"/>
-              <w:bottom w:w="100" w:type="dxa"/>
-              <w:left w:w="120" w:type="dxa"/>
-              <w:right w:w="120" w:type="dxa"/>
-            </w:tcMar>
-          </w:tcPr>
-          <w:p>
-            <w:r>
-              <w:rPr>
-                <w:color w:val="1F2937"/>
-                <w:sz w:val="18"/>
-              </w:rPr>
-              <w:t>Import data master produk, barcode, harga jual, data pelanggan, supplier, dan stok awal.</w:t>
-            </w:r>
-          </w:p>
-        </w:tc>
-        <w:tc>
-          <w:tcPr>
-            <w:tcW w:type="dxa" w:w="2340"/>
-            <w:shd w:fill="F9FAFB"/>
-            <w:tcMar>
-              <w:top w:w="100" w:type="dxa"/>
-              <w:bottom w:w="100" w:type="dxa"/>
-              <w:left w:w="120" w:type="dxa"/>
-              <w:right w:w="120" w:type="dxa"/>
-            </w:tcMar>
-          </w:tcPr>
-          <w:p>
-            <w:r>
-              <w:rPr>
-                <w:color w:val="1F2937"/>
-                <w:sz w:val="18"/>
-              </w:rPr>
-              <w:t>Database Lengkap &amp; Tervalidasi</w:t>
-            </w:r>
-          </w:p>
-        </w:tc>
-      </w:tr>
-      <w:tr>
-        <w:tc>
-          <w:tcPr>
-            <w:tcW w:type="dxa" w:w="2340"/>
-            <w:shd w:fill="FFFFFF"/>
-            <w:tcMar>
-              <w:top w:w="100" w:type="dxa"/>
-              <w:bottom w:w="100" w:type="dxa"/>
-              <w:left w:w="120" w:type="dxa"/>
-              <w:right w:w="120" w:type="dxa"/>
-            </w:tcMar>
-          </w:tcPr>
-          <w:p>
-            <w:r>
-              <w:rPr>
-                <w:b/>
-                <w:color w:val="1E3A8A"/>
-                <w:sz w:val="18"/>
-              </w:rPr>
-              <w:t>Tahap 3: Pelatihan &amp; UAT</w:t>
-            </w:r>
-          </w:p>
-        </w:tc>
-        <w:tc>
-          <w:tcPr>
-            <w:tcW w:type="dxa" w:w="2340"/>
-            <w:shd w:fill="FFFFFF"/>
-            <w:tcMar>
-              <w:top w:w="100" w:type="dxa"/>
-              <w:bottom w:w="100" w:type="dxa"/>
-              <w:left w:w="120" w:type="dxa"/>
-              <w:right w:w="120" w:type="dxa"/>
-            </w:tcMar>
-          </w:tcPr>
-          <w:p>
-            <w:r>
-              <w:rPr>
-                <w:color w:val="1F2937"/>
-                <w:sz w:val="18"/>
-              </w:rPr>
-              <w:t>Minggu 3</w:t>
-            </w:r>
-          </w:p>
-        </w:tc>
-        <w:tc>
-          <w:tcPr>
-            <w:tcW w:type="dxa" w:w="2340"/>
-            <w:shd w:fill="FFFFFF"/>
-            <w:tcMar>
-              <w:top w:w="100" w:type="dxa"/>
-              <w:bottom w:w="100" w:type="dxa"/>
-              <w:left w:w="120" w:type="dxa"/>
-              <w:right w:w="120" w:type="dxa"/>
-            </w:tcMar>
-          </w:tcPr>
-          <w:p>
-            <w:r>
-              <w:rPr>
-                <w:color w:val="1F2937"/>
-                <w:sz w:val="18"/>
-              </w:rPr>
-              <w:t>Pelatihan staf kasir, tim gudang, serta admin akuntansi. Simulasi transaksi nyata hulu-hilir.</w:t>
-            </w:r>
-          </w:p>
-        </w:tc>
-        <w:tc>
-          <w:tcPr>
-            <w:tcW w:type="dxa" w:w="2340"/>
-            <w:shd w:fill="FFFFFF"/>
-            <w:tcMar>
-              <w:top w:w="100" w:type="dxa"/>
-              <w:bottom w:w="100" w:type="dxa"/>
-              <w:left w:w="120" w:type="dxa"/>
-              <w:right w:w="120" w:type="dxa"/>
-            </w:tcMar>
-          </w:tcPr>
-          <w:p>
-            <w:r>
-              <w:rPr>
-                <w:color w:val="1F2937"/>
-                <w:sz w:val="18"/>
-              </w:rPr>
-              <w:t>Berita Acara User Acceptance Test (UAT)</w:t>
-            </w:r>
-          </w:p>
-        </w:tc>
-      </w:tr>
-      <w:tr>
-        <w:tc>
-          <w:tcPr>
-            <w:tcW w:type="dxa" w:w="2340"/>
-            <w:shd w:fill="F9FAFB"/>
-            <w:tcMar>
-              <w:top w:w="100" w:type="dxa"/>
-              <w:bottom w:w="100" w:type="dxa"/>
-              <w:left w:w="120" w:type="dxa"/>
-              <w:right w:w="120" w:type="dxa"/>
-            </w:tcMar>
-          </w:tcPr>
-          <w:p>
-            <w:r>
-              <w:rPr>
-                <w:b/>
-                <w:color w:val="1E3A8A"/>
-                <w:sz w:val="18"/>
-              </w:rPr>
-              <w:t>Tahap 4: Go-Live &amp; Handover</w:t>
-            </w:r>
-          </w:p>
-        </w:tc>
-        <w:tc>
-          <w:tcPr>
-            <w:tcW w:type="dxa" w:w="2340"/>
-            <w:shd w:fill="F9FAFB"/>
-            <w:tcMar>
-              <w:top w:w="100" w:type="dxa"/>
-              <w:bottom w:w="100" w:type="dxa"/>
-              <w:left w:w="120" w:type="dxa"/>
-              <w:right w:w="120" w:type="dxa"/>
-            </w:tcMar>
-          </w:tcPr>
-          <w:p>
-            <w:r>
-              <w:rPr>
-                <w:color w:val="1F2937"/>
-                <w:sz w:val="18"/>
-              </w:rPr>
-              <w:t>Minggu 4</w:t>
-            </w:r>
-          </w:p>
-        </w:tc>
-        <w:tc>
-          <w:tcPr>
-            <w:tcW w:type="dxa" w:w="2340"/>
-            <w:shd w:fill="F9FAFB"/>
-            <w:tcMar>
-              <w:top w:w="100" w:type="dxa"/>
-              <w:bottom w:w="100" w:type="dxa"/>
-              <w:left w:w="120" w:type="dxa"/>
-              <w:right w:w="120" w:type="dxa"/>
-            </w:tcMar>
-          </w:tcPr>
-          <w:p>
-            <w:r>
-              <w:rPr>
-                <w:color w:val="1F2937"/>
-                <w:sz w:val="18"/>
-              </w:rPr>
-              <w:t>Peluncuran operasional live di toko, pendampingan transaksi kasir, dan penyerahan sertifikat lisensi.</w:t>
-            </w:r>
-          </w:p>
-        </w:tc>
-        <w:tc>
-          <w:tcPr>
-            <w:tcW w:type="dxa" w:w="2340"/>
-            <w:shd w:fill="F9FAFB"/>
-            <w:tcMar>
-              <w:top w:w="100" w:type="dxa"/>
-              <w:bottom w:w="100" w:type="dxa"/>
-              <w:left w:w="120" w:type="dxa"/>
-              <w:right w:w="120" w:type="dxa"/>
-            </w:tcMar>
-          </w:tcPr>
-          <w:p>
-            <w:r>
-              <w:rPr>
-                <w:color w:val="1F2937"/>
-                <w:sz w:val="18"/>
-              </w:rPr>
-              <w:t>Sistem Beroperasi Penuh &amp; Sertifikat Lisensi</w:t>
-            </w:r>
-          </w:p>
-        </w:tc>
-      </w:tr>
-    </w:tbl>
+    <w:p>
+      <w:pPr>
+        <w:spacing w:before="80" w:after="40"/>
+      </w:pPr>
+      <w:r>
+        <w:rPr>
+          <w:b/>
+          <w:color w:val="0D9488"/>
+          <w:sz w:val="20"/>
+        </w:rPr>
+        <w:t>✓ Kasir Cepat &amp; Tertib (Point of Sale):</w:t>
+        <w:br/>
+      </w:r>
+      <w:r>
+        <w:rPr>
+          <w:color w:val="1F2937"/>
+          <w:sz w:val="19"/>
+        </w:rPr>
+        <w:t>Proses checkout pelanggan membutuhkan waktu kurang dari 3 detik. Mendukung scanner barcode dan printer struk thermal. Kasir diwajibkan menghitung fisik uang tunai saat tutup shift (Blind Count) sebelum melihat angka sistem, sehingga selisih setoran langsung terdeteksi.</w:t>
+      </w:r>
+    </w:p>
+    <w:p>
+      <w:pPr>
+        <w:spacing w:before="80" w:after="40"/>
+      </w:pPr>
+      <w:r>
+        <w:rPr>
+          <w:b/>
+          <w:color w:val="0D9488"/>
+          <w:sz w:val="20"/>
+        </w:rPr>
+        <w:t>✓ Pengawasan Stok Multi-Gudang &amp; Surat Jalan Resmi:</w:t>
+        <w:br/>
+      </w:r>
+      <w:r>
+        <w:rPr>
+          <w:color w:val="1F2937"/>
+          <w:sz w:val="19"/>
+        </w:rPr>
+        <w:t>Perpindahan barang antar cabang tercatat resmi melalui Surat Jalan (Delivery Order) dan verifikasi penerimaan fisik. Fitur stok opname digital memungkinkan penghitungan persediaan harian/mingguan tanpa harus menutup operasional toko.</w:t>
+      </w:r>
+    </w:p>
+    <w:p>
+      <w:pPr>
+        <w:spacing w:before="80" w:after="40"/>
+      </w:pPr>
+      <w:r>
+        <w:rPr>
+          <w:b/>
+          <w:color w:val="0D9488"/>
+          <w:sz w:val="20"/>
+        </w:rPr>
+        <w:t>✓ Otomatisasi Pembukuan Tanpa Perlu Akuntan Mahal:</w:t>
+        <w:br/>
+      </w:r>
+      <w:r>
+        <w:rPr>
+          <w:color w:val="1F2937"/>
+          <w:sz w:val="19"/>
+        </w:rPr>
+        <w:t>Setiap ada barang terjual di kasir atau barang masuk dari supplier, sistem secara otomatis membentuk jurnal akuntansi berpasangan (Debit-Kredit). Laporan Laba Rugi dan Neraca Keuangan perusahaan selalu ter-update secara real-time.</w:t>
+      </w:r>
+    </w:p>
+    <w:p>
+      <w:pPr>
+        <w:spacing w:before="80" w:after="40"/>
+      </w:pPr>
+      <w:r>
+        <w:rPr>
+          <w:b/>
+          <w:color w:val="0D9488"/>
+          <w:sz w:val="20"/>
+        </w:rPr>
+        <w:t>✓ Audit Trail Permanen &amp; Proteksi Keamanan:</w:t>
+        <w:br/>
+      </w:r>
+      <w:r>
+        <w:rPr>
+          <w:color w:val="1F2937"/>
+          <w:sz w:val="19"/>
+        </w:rPr>
+        <w:t>Seluruh aktivitas sistem—mulai dari perubahan harga produk, retur barang, pembatalan nota, hingga pembayaran faktur—terekam dalam log audit permanen yang tidak dapat diedit atau dihapus oleh staf manapun, memberikan rasa aman 100% bagi pemilik usaha.</w:t>
+      </w:r>
+    </w:p>
     <w:p>
       <w:r>
         <w:br w:type="page"/>
@@ -2749,7 +1888,7 @@
           <w:color w:val="1E3A8A"/>
           <w:sz w:val="32"/>
         </w:rPr>
-        <w:t>7. Jaminan Garansi Bebas Bug &amp; Standar Layanan Purna Jual</w:t>
+        <w:t>5. Struktur Investasi &amp; Skema Pembayaran Bertahap</w:t>
       </w:r>
     </w:p>
     <w:p>
@@ -2757,49 +1896,7 @@
         <w:spacing w:after="160" w:line="276" w:lineRule="auto"/>
       </w:pPr>
       <w:r>
-        <w:t>Untuk memberikan kepastian dan ketenangan pikiran bagi manajemen perusahaan, kami menyediakan skema garansi dan pemeliharaan purna jual yang jelas, transparan, dan terstruktur:</w:t>
-      </w:r>
-    </w:p>
-    <w:p>
-      <w:pPr>
-        <w:spacing w:before="80" w:after="40"/>
-      </w:pPr>
-      <w:r>
-        <w:rPr>
-          <w:b/>
-          <w:color w:val="0D9488"/>
-          <w:sz w:val="22"/>
-        </w:rPr>
-        <w:t>A. Garansi Bebas Bug (6 Bulan Pertama — GRATIS)</w:t>
-      </w:r>
-    </w:p>
-    <w:p>
-      <w:pPr>
-        <w:spacing w:after="200" w:line="276" w:lineRule="auto"/>
-      </w:pPr>
-      <w:r>
-        <w:t>Selama 6 (enam) bulan pertama terhitung sejak tanggal Go-Live, seluruh perbaikan terhadap potensi bug teknis, kesalahan formula sistem, atau kendala operasional diselesaikan secara **CUMA-CUMA (Rp 0,- / GRATIS)**. Bantuan darurat terhadap kendala kasir direspon dengan target SLA &lt; 1 jam kerja.</w:t>
-      </w:r>
-    </w:p>
-    <w:p>
-      <w:pPr>
-        <w:spacing w:before="80" w:after="40"/>
-      </w:pPr>
-      <w:r>
-        <w:rPr>
-          <w:b/>
-          <w:color w:val="0D9488"/>
-          <w:sz w:val="22"/>
-        </w:rPr>
-        <w:t>B. Skema Layanan Pemeliharaan Pasca Masa Garansi (Opsional)</w:t>
-      </w:r>
-    </w:p>
-    <w:p>
-      <w:pPr>
-        <w:spacing w:after="120" w:line="276" w:lineRule="auto"/>
-      </w:pPr>
-      <w:r>
-        <w:t>Setelah masa garansi 6 bulan berakhir, sistem tetap dapat digunakan secara normal tanpa ada kewajiban membayar biaya apapun. Namun jika klien menghendaki pendampingan teknis jangka panjang, tersedia 2 skema pemeliharaan standar industri:</w:t>
+        <w:t>Seluruh paket investasi di bawah ini bersifat **sekali bayar (One-Time Fee)** dan sudah merupakan paket terpadu: mencakup lisensi hak milik sistem seumur hidup, jasa instalasi server, migrasi data awal, pelatihan staf, serta garansi purna jual:</w:t>
       </w:r>
     </w:p>
     <w:tbl>
@@ -2832,7 +1929,7 @@
                 <w:color w:val="FFFFFF"/>
                 <w:sz w:val="19"/>
               </w:rPr>
-              <w:t>Opsi Layanan Purna Jual</w:t>
+              <w:t>Pilihan Paket Solusi</w:t>
             </w:r>
           </w:p>
         </w:tc>
@@ -2854,7 +1951,7 @@
                 <w:color w:val="FFFFFF"/>
                 <w:sz w:val="19"/>
               </w:rPr>
-              <w:t>Cakupan Layanan</w:t>
+              <w:t>Nilai Investasi (One-Time)</w:t>
             </w:r>
           </w:p>
         </w:tc>
@@ -2876,7 +1973,7 @@
                 <w:color w:val="FFFFFF"/>
                 <w:sz w:val="19"/>
               </w:rPr>
-              <w:t>Standar Biaya Jasa</w:t>
+              <w:t>Cakupan Layanan Implementasi Termasuk</w:t>
             </w:r>
           </w:p>
         </w:tc>
@@ -2886,6 +1983,199 @@
           <w:tcPr>
             <w:tcW w:type="dxa" w:w="3120"/>
             <w:shd w:fill="FFFFFF"/>
+            <w:tcMar>
+              <w:top w:w="120" w:type="dxa"/>
+              <w:bottom w:w="120" w:type="dxa"/>
+              <w:left w:w="130" w:type="dxa"/>
+              <w:right w:w="130" w:type="dxa"/>
+            </w:tcMar>
+          </w:tcPr>
+          <w:p>
+            <w:r>
+              <w:rPr>
+                <w:b/>
+                <w:color w:val="1E3A8A"/>
+                <w:sz w:val="19"/>
+              </w:rPr>
+              <w:t>Paket STARTER</w:t>
+              <w:br/>
+              <w:t>(Toko / Gerai Mandiri)</w:t>
+            </w:r>
+          </w:p>
+        </w:tc>
+        <w:tc>
+          <w:tcPr>
+            <w:tcW w:type="dxa" w:w="3120"/>
+            <w:shd w:fill="FFFFFF"/>
+            <w:tcMar>
+              <w:top w:w="120" w:type="dxa"/>
+              <w:bottom w:w="120" w:type="dxa"/>
+              <w:left w:w="130" w:type="dxa"/>
+              <w:right w:w="130" w:type="dxa"/>
+            </w:tcMar>
+          </w:tcPr>
+          <w:p>
+            <w:pPr>
+              <w:jc w:val="center"/>
+            </w:pPr>
+            <w:r>
+              <w:rPr>
+                <w:b/>
+                <w:color w:val="B45309"/>
+                <w:sz w:val="22"/>
+              </w:rPr>
+              <w:t>Rp 16.500.000,-</w:t>
+              <w:br/>
+              <w:t>(Sekali Bayar)</w:t>
+            </w:r>
+          </w:p>
+        </w:tc>
+        <w:tc>
+          <w:tcPr>
+            <w:tcW w:type="dxa" w:w="3120"/>
+            <w:shd w:fill="FFFFFF"/>
+            <w:tcMar>
+              <w:top w:w="120" w:type="dxa"/>
+              <w:bottom w:w="120" w:type="dxa"/>
+              <w:left w:w="130" w:type="dxa"/>
+              <w:right w:w="130" w:type="dxa"/>
+            </w:tcMar>
+          </w:tcPr>
+          <w:p>
+            <w:r>
+              <w:rPr>
+                <w:color w:val="1F2937"/>
+                <w:sz w:val="17"/>
+              </w:rPr>
+              <w:t>• Lisensi Hak Milik Toko Tunggal (Single Outlet &amp; Gudang Toko)</w:t>
+              <w:br/>
+              <w:t>• Bebas buat akun staf &amp; kasir toko (Tanpa biaya lisensi per user)</w:t>
+              <w:br/>
+              <w:t>• Setup Server Lokal Toko / VPS Standar</w:t>
+              <w:br/>
+              <w:t>• Impor Master Produk &amp; Stok Awal dari Excel</w:t>
+              <w:br/>
+              <w:t>• Pelatihan 1 Sesi untuk Tim Kasir &amp; Pengelola Toko</w:t>
+              <w:br/>
+              <w:t>• Garansi Bebas Bug 3 Bulan Penuh</w:t>
+            </w:r>
+          </w:p>
+        </w:tc>
+      </w:tr>
+      <w:tr>
+        <w:tc>
+          <w:tcPr>
+            <w:tcW w:type="dxa" w:w="3120"/>
+            <w:shd w:fill="F0FDF4"/>
+            <w:tcMar>
+              <w:top w:w="120" w:type="dxa"/>
+              <w:bottom w:w="120" w:type="dxa"/>
+              <w:left w:w="130" w:type="dxa"/>
+              <w:right w:w="130" w:type="dxa"/>
+            </w:tcMar>
+          </w:tcPr>
+          <w:p>
+            <w:r>
+              <w:rPr>
+                <w:b/>
+                <w:color w:val="1E3A8A"/>
+                <w:sz w:val="19"/>
+              </w:rPr>
+              <w:t>Paket ENTERPRISE</w:t>
+              <w:br/>
+              <w:t>(Multi-Cabang &amp; Rantai Pasok)</w:t>
+            </w:r>
+          </w:p>
+        </w:tc>
+        <w:tc>
+          <w:tcPr>
+            <w:tcW w:type="dxa" w:w="3120"/>
+            <w:shd w:fill="F0FDF4"/>
+            <w:tcMar>
+              <w:top w:w="120" w:type="dxa"/>
+              <w:bottom w:w="120" w:type="dxa"/>
+              <w:left w:w="130" w:type="dxa"/>
+              <w:right w:w="130" w:type="dxa"/>
+            </w:tcMar>
+          </w:tcPr>
+          <w:p>
+            <w:pPr>
+              <w:jc w:val="center"/>
+            </w:pPr>
+            <w:r>
+              <w:rPr>
+                <w:b/>
+                <w:color w:val="166534"/>
+                <w:sz w:val="22"/>
+              </w:rPr>
+              <w:t>Rp 38.500.000,-</w:t>
+              <w:br/>
+              <w:t>(Sekali Bayar)</w:t>
+            </w:r>
+          </w:p>
+        </w:tc>
+        <w:tc>
+          <w:tcPr>
+            <w:tcW w:type="dxa" w:w="3120"/>
+            <w:shd w:fill="F0FDF4"/>
+            <w:tcMar>
+              <w:top w:w="120" w:type="dxa"/>
+              <w:bottom w:w="120" w:type="dxa"/>
+              <w:left w:w="130" w:type="dxa"/>
+              <w:right w:w="130" w:type="dxa"/>
+            </w:tcMar>
+          </w:tcPr>
+          <w:p>
+            <w:r>
+              <w:rPr>
+                <w:color w:val="1F2937"/>
+                <w:sz w:val="17"/>
+              </w:rPr>
+              <w:t>• Lisensi Hak Milik Multi-Cabang &amp; Rantai Pasok Terpadu</w:t>
+              <w:br/>
+              <w:t>• Bebas buka cabang baru &amp; tambah kasir tanpa beli lisensi lagi</w:t>
+              <w:br/>
+              <w:t>• Setup Private Cloud / Server Korporat Dedicated</w:t>
+              <w:br/>
+              <w:t>• Migrasi Data Lengkap Multi-Cabang (Produk, Customer, Supplier, Saldo)</w:t>
+              <w:br/>
+              <w:t>• Pelatihan Komprehensif per Divisi (Gudang, Kasir, Finance)</w:t>
+              <w:br/>
+              <w:t>• Garansi Bebas Bug 6 Bulan Penuh + SLA Prioritas &lt; 1 Jam</w:t>
+            </w:r>
+          </w:p>
+        </w:tc>
+      </w:tr>
+    </w:tbl>
+    <w:p>
+      <w:pPr>
+        <w:spacing w:before="280" w:after="80"/>
+      </w:pPr>
+      <w:r>
+        <w:rPr>
+          <w:b/>
+          <w:color w:val="1E3A8A"/>
+          <w:sz w:val="22"/>
+        </w:rPr>
+        <w:t>Tahapan Pembayaran Berbasis Progres (Term of Payment):</w:t>
+      </w:r>
+    </w:p>
+    <w:tbl>
+      <w:tblPr>
+        <w:tblW w:type="auto" w:w="0"/>
+        <w:jc w:val="center"/>
+        <w:tblLook w:firstColumn="1" w:firstRow="1" w:lastColumn="0" w:lastRow="0" w:noHBand="0" w:noVBand="1" w:val="04A0"/>
+      </w:tblPr>
+      <w:tblGrid>
+        <w:gridCol w:w="3120"/>
+        <w:gridCol w:w="3120"/>
+        <w:gridCol w:w="3120"/>
+      </w:tblGrid>
+      <w:tr>
+        <w:tc>
+          <w:tcPr>
+            <w:tcW w:type="dxa" w:w="3120"/>
+            <w:shd w:fill="1E3A8A"/>
             <w:tcMar>
               <w:top w:w="100" w:type="dxa"/>
               <w:bottom w:w="100" w:type="dxa"/>
@@ -2897,38 +2187,17 @@
             <w:r>
               <w:rPr>
                 <w:b/>
-                <w:color w:val="1E3A8A"/>
+                <w:color w:val="FFFFFF"/>
                 <w:sz w:val="18"/>
               </w:rPr>
-              <w:t>Opsi 1: Kontrak Pemeliharaan Tahunan (AMC) — Sangat Direkomendasikan</w:t>
+              <w:t>Tahap Pembayaran</w:t>
             </w:r>
           </w:p>
         </w:tc>
         <w:tc>
           <w:tcPr>
             <w:tcW w:type="dxa" w:w="3120"/>
-            <w:shd w:fill="FFFFFF"/>
-            <w:tcMar>
-              <w:top w:w="100" w:type="dxa"/>
-              <w:bottom w:w="100" w:type="dxa"/>
-              <w:left w:w="120" w:type="dxa"/>
-              <w:right w:w="120" w:type="dxa"/>
-            </w:tcMar>
-          </w:tcPr>
-          <w:p>
-            <w:r>
-              <w:rPr>
-                <w:color w:val="1F2937"/>
-                <w:sz w:val="18"/>
-              </w:rPr>
-              <w:t>Perbaikan bug tanpa batas selama 1 tahun penuh, monitoring kesehatan server &amp; backup berkala, serta bantuan darurat prioritas (&lt;1 jam).</w:t>
-            </w:r>
-          </w:p>
-        </w:tc>
-        <w:tc>
-          <w:tcPr>
-            <w:tcW w:type="dxa" w:w="3120"/>
-            <w:shd w:fill="FFFFFF"/>
+            <w:shd w:fill="1E3A8A"/>
             <w:tcMar>
               <w:top w:w="100" w:type="dxa"/>
               <w:bottom w:w="100" w:type="dxa"/>
@@ -2940,19 +2209,17 @@
             <w:r>
               <w:rPr>
                 <w:b/>
-                <w:color w:val="B45309"/>
+                <w:color w:val="FFFFFF"/>
                 <w:sz w:val="18"/>
               </w:rPr>
-              <w:t>10% - 15% dari nilai lisensi / tahun (± Rp 4.500.000,- s/d Rp 6.000.000,- / tahun)</w:t>
+              <w:t>Porsi</w:t>
             </w:r>
           </w:p>
         </w:tc>
-      </w:tr>
-      <w:tr>
         <w:tc>
           <w:tcPr>
             <w:tcW w:type="dxa" w:w="3120"/>
-            <w:shd w:fill="F9FAFB"/>
+            <w:shd w:fill="1E3A8A"/>
             <w:tcMar>
               <w:top w:w="100" w:type="dxa"/>
               <w:bottom w:w="100" w:type="dxa"/>
@@ -2964,10 +2231,101 @@
             <w:r>
               <w:rPr>
                 <w:b/>
-                <w:color w:val="1E3A8A"/>
+                <w:color w:val="FFFFFF"/>
                 <w:sz w:val="18"/>
               </w:rPr>
-              <w:t>Opsi 2: Perbaikan Bug Minor (On-Demand / Pay-per-Case)</w:t>
+              <w:t>Kriteria Penagihan (Milestone Hasil Nyata)</w:t>
+            </w:r>
+          </w:p>
+        </w:tc>
+      </w:tr>
+      <w:tr>
+        <w:tc>
+          <w:tcPr>
+            <w:tcW w:type="dxa" w:w="3120"/>
+            <w:shd w:fill="FFFFFF"/>
+            <w:tcMar>
+              <w:top w:w="90" w:type="dxa"/>
+              <w:bottom w:w="90" w:type="dxa"/>
+              <w:left w:w="110" w:type="dxa"/>
+              <w:right w:w="110" w:type="dxa"/>
+            </w:tcMar>
+          </w:tcPr>
+          <w:p>
+            <w:r>
+              <w:rPr>
+                <w:b/>
+                <w:color w:val="1E3A8A"/>
+                <w:sz w:val="17"/>
+              </w:rPr>
+              <w:t>Tahap I (Uang Muka / DP)</w:t>
+            </w:r>
+          </w:p>
+        </w:tc>
+        <w:tc>
+          <w:tcPr>
+            <w:tcW w:type="dxa" w:w="3120"/>
+            <w:shd w:fill="FFFFFF"/>
+            <w:tcMar>
+              <w:top w:w="90" w:type="dxa"/>
+              <w:bottom w:w="90" w:type="dxa"/>
+              <w:left w:w="110" w:type="dxa"/>
+              <w:right w:w="110" w:type="dxa"/>
+            </w:tcMar>
+          </w:tcPr>
+          <w:p>
+            <w:r>
+              <w:rPr>
+                <w:b/>
+                <w:color w:val="0D9488"/>
+                <w:sz w:val="17"/>
+              </w:rPr>
+              <w:t>40%</w:t>
+            </w:r>
+          </w:p>
+        </w:tc>
+        <w:tc>
+          <w:tcPr>
+            <w:tcW w:type="dxa" w:w="3120"/>
+            <w:shd w:fill="FFFFFF"/>
+            <w:tcMar>
+              <w:top w:w="90" w:type="dxa"/>
+              <w:bottom w:w="90" w:type="dxa"/>
+              <w:left w:w="110" w:type="dxa"/>
+              <w:right w:w="110" w:type="dxa"/>
+            </w:tcMar>
+          </w:tcPr>
+          <w:p>
+            <w:r>
+              <w:rPr>
+                <w:color w:val="1F2937"/>
+                <w:sz w:val="17"/>
+              </w:rPr>
+              <w:t>Dibayarkan saat persetujuan kesepakatan implementasi untuk memulai setup server &amp; konfigurasi awal.</w:t>
+            </w:r>
+          </w:p>
+        </w:tc>
+      </w:tr>
+      <w:tr>
+        <w:tc>
+          <w:tcPr>
+            <w:tcW w:type="dxa" w:w="3120"/>
+            <w:shd w:fill="F9FAFB"/>
+            <w:tcMar>
+              <w:top w:w="90" w:type="dxa"/>
+              <w:bottom w:w="90" w:type="dxa"/>
+              <w:left w:w="110" w:type="dxa"/>
+              <w:right w:w="110" w:type="dxa"/>
+            </w:tcMar>
+          </w:tcPr>
+          <w:p>
+            <w:r>
+              <w:rPr>
+                <w:b/>
+                <w:color w:val="1E3A8A"/>
+                <w:sz w:val="17"/>
+              </w:rPr>
+              <w:t>Tahap II (Progress Setup &amp; Data)</w:t>
             </w:r>
           </w:p>
         </w:tc>
@@ -2976,19 +2334,20 @@
             <w:tcW w:type="dxa" w:w="3120"/>
             <w:shd w:fill="F9FAFB"/>
             <w:tcMar>
-              <w:top w:w="100" w:type="dxa"/>
-              <w:bottom w:w="100" w:type="dxa"/>
-              <w:left w:w="120" w:type="dxa"/>
-              <w:right w:w="120" w:type="dxa"/>
+              <w:top w:w="90" w:type="dxa"/>
+              <w:bottom w:w="90" w:type="dxa"/>
+              <w:left w:w="110" w:type="dxa"/>
+              <w:right w:w="110" w:type="dxa"/>
             </w:tcMar>
           </w:tcPr>
           <w:p>
             <w:r>
               <w:rPr>
-                <w:color w:val="1F2937"/>
-                <w:sz w:val="18"/>
+                <w:b/>
+                <w:color w:val="0D9488"/>
+                <w:sz w:val="17"/>
               </w:rPr>
-              <w:t>Penanganan kendala format print struk, perbaikan layout laporan Excel, penyesuaian teks/label, atau salah input pengguna kasir.</w:t>
+              <w:t>40%</w:t>
             </w:r>
           </w:p>
         </w:tc>
@@ -2996,6 +2355,130 @@
           <w:tcPr>
             <w:tcW w:type="dxa" w:w="3120"/>
             <w:shd w:fill="F9FAFB"/>
+            <w:tcMar>
+              <w:top w:w="90" w:type="dxa"/>
+              <w:bottom w:w="90" w:type="dxa"/>
+              <w:left w:w="110" w:type="dxa"/>
+              <w:right w:w="110" w:type="dxa"/>
+            </w:tcMar>
+          </w:tcPr>
+          <w:p>
+            <w:r>
+              <w:rPr>
+                <w:color w:val="1F2937"/>
+                <w:sz w:val="17"/>
+              </w:rPr>
+              <w:t>Dibayarkan setelah server siap, data produk berhasil dimigrasi, dan staf selesai mengikuti sesi pelatihan.</w:t>
+            </w:r>
+          </w:p>
+        </w:tc>
+      </w:tr>
+      <w:tr>
+        <w:tc>
+          <w:tcPr>
+            <w:tcW w:type="dxa" w:w="3120"/>
+            <w:shd w:fill="FFFFFF"/>
+            <w:tcMar>
+              <w:top w:w="90" w:type="dxa"/>
+              <w:bottom w:w="90" w:type="dxa"/>
+              <w:left w:w="110" w:type="dxa"/>
+              <w:right w:w="110" w:type="dxa"/>
+            </w:tcMar>
+          </w:tcPr>
+          <w:p>
+            <w:r>
+              <w:rPr>
+                <w:b/>
+                <w:color w:val="1E3A8A"/>
+                <w:sz w:val="17"/>
+              </w:rPr>
+              <w:t>Tahap III (Pelunasan Akhir)</w:t>
+            </w:r>
+          </w:p>
+        </w:tc>
+        <w:tc>
+          <w:tcPr>
+            <w:tcW w:type="dxa" w:w="3120"/>
+            <w:shd w:fill="FFFFFF"/>
+            <w:tcMar>
+              <w:top w:w="90" w:type="dxa"/>
+              <w:bottom w:w="90" w:type="dxa"/>
+              <w:left w:w="110" w:type="dxa"/>
+              <w:right w:w="110" w:type="dxa"/>
+            </w:tcMar>
+          </w:tcPr>
+          <w:p>
+            <w:r>
+              <w:rPr>
+                <w:b/>
+                <w:color w:val="0D9488"/>
+                <w:sz w:val="17"/>
+              </w:rPr>
+              <w:t>20%</w:t>
+            </w:r>
+          </w:p>
+        </w:tc>
+        <w:tc>
+          <w:tcPr>
+            <w:tcW w:type="dxa" w:w="3120"/>
+            <w:shd w:fill="FFFFFF"/>
+            <w:tcMar>
+              <w:top w:w="90" w:type="dxa"/>
+              <w:bottom w:w="90" w:type="dxa"/>
+              <w:left w:w="110" w:type="dxa"/>
+              <w:right w:w="110" w:type="dxa"/>
+            </w:tcMar>
+          </w:tcPr>
+          <w:p>
+            <w:r>
+              <w:rPr>
+                <w:color w:val="1F2937"/>
+                <w:sz w:val="17"/>
+              </w:rPr>
+              <w:t>Dibayarkan setelah sistem beroperasi lancar melayani transaksi nyata di toko (Go-Live) dan serah terima resmi.</w:t>
+            </w:r>
+          </w:p>
+        </w:tc>
+      </w:tr>
+    </w:tbl>
+    <w:p>
+      <w:pPr>
+        <w:spacing w:before="280" w:after="120"/>
+      </w:pPr>
+      <w:r>
+        <w:rPr>
+          <w:rFonts w:ascii="Calibri" w:hAnsi="Calibri"/>
+          <w:b/>
+          <w:color w:val="1E3A8A"/>
+          <w:sz w:val="32"/>
+        </w:rPr>
+        <w:t>6. Jadwal Kerja Terarah &amp; Garansi Purna Jual</w:t>
+      </w:r>
+    </w:p>
+    <w:p>
+      <w:pPr>
+        <w:spacing w:after="120"/>
+      </w:pPr>
+      <w:r>
+        <w:t>Proses implementasi dirancang agar tidak mengganggu operasional toko yang sedang berjalan, dengan target penyelesaian dalam kurun waktu 2 s/d 4 minggu:</w:t>
+      </w:r>
+    </w:p>
+    <w:tbl>
+      <w:tblPr>
+        <w:tblW w:type="auto" w:w="0"/>
+        <w:jc w:val="center"/>
+        <w:tblLook w:firstColumn="1" w:firstRow="1" w:lastColumn="0" w:lastRow="0" w:noHBand="0" w:noVBand="1" w:val="04A0"/>
+      </w:tblPr>
+      <w:tblGrid>
+        <w:gridCol w:w="3120"/>
+        <w:gridCol w:w="3120"/>
+        <w:gridCol w:w="3120"/>
+      </w:tblGrid>
+      <w:tr>
+        <w:tc>
+          <w:tcPr>
+            <w:tcW w:type="dxa" w:w="3120"/>
+            <w:shd w:fill="1E3A8A"/>
             <w:tcMar>
               <w:top w:w="100" w:type="dxa"/>
               <w:bottom w:w="100" w:type="dxa"/>
@@ -3007,19 +2490,17 @@
             <w:r>
               <w:rPr>
                 <w:b/>
-                <w:color w:val="B45309"/>
+                <w:color w:val="FFFFFF"/>
                 <w:sz w:val="18"/>
               </w:rPr>
-              <w:t>Rp 300.000,- s/d Rp 500.000,- per penanganan kasus</w:t>
+              <w:t>Minggu Pelaksanaan</w:t>
             </w:r>
           </w:p>
         </w:tc>
-      </w:tr>
-      <w:tr>
         <w:tc>
           <w:tcPr>
             <w:tcW w:type="dxa" w:w="3120"/>
-            <w:shd w:fill="FFFFFF"/>
+            <w:shd w:fill="1E3A8A"/>
             <w:tcMar>
               <w:top w:w="100" w:type="dxa"/>
               <w:bottom w:w="100" w:type="dxa"/>
@@ -3031,38 +2512,17 @@
             <w:r>
               <w:rPr>
                 <w:b/>
-                <w:color w:val="1E3A8A"/>
+                <w:color w:val="FFFFFF"/>
                 <w:sz w:val="18"/>
               </w:rPr>
-              <w:t>Opsi 3: Perbaikan Bug Major (On-Demand / Pay-per-Case)</w:t>
+              <w:t>Aktivitas Utama</w:t>
             </w:r>
           </w:p>
         </w:tc>
         <w:tc>
           <w:tcPr>
             <w:tcW w:type="dxa" w:w="3120"/>
-            <w:shd w:fill="FFFFFF"/>
-            <w:tcMar>
-              <w:top w:w="100" w:type="dxa"/>
-              <w:bottom w:w="100" w:type="dxa"/>
-              <w:left w:w="120" w:type="dxa"/>
-              <w:right w:w="120" w:type="dxa"/>
-            </w:tcMar>
-          </w:tcPr>
-          <w:p>
-            <w:r>
-              <w:rPr>
-                <w:color w:val="1F2937"/>
-                <w:sz w:val="18"/>
-              </w:rPr>
-              <w:t>Penanganan selisih formula kalkulasi diskon, kendala koneksi kasir ke database, atau masalah integrasi pembayaran.</w:t>
-            </w:r>
-          </w:p>
-        </w:tc>
-        <w:tc>
-          <w:tcPr>
-            <w:tcW w:type="dxa" w:w="3120"/>
-            <w:shd w:fill="FFFFFF"/>
+            <w:shd w:fill="1E3A8A"/>
             <w:tcMar>
               <w:top w:w="100" w:type="dxa"/>
               <w:bottom w:w="100" w:type="dxa"/>
@@ -3074,10 +2534,76 @@
             <w:r>
               <w:rPr>
                 <w:b/>
-                <w:color w:val="B45309"/>
+                <w:color w:val="FFFFFF"/>
                 <w:sz w:val="18"/>
               </w:rPr>
-              <w:t>Rp 1.000.000,- s/d Rp 2.000.000,- per penanganan kasus</w:t>
+              <w:t>Hasil Nyata (Deliverables)</w:t>
+            </w:r>
+          </w:p>
+        </w:tc>
+      </w:tr>
+      <w:tr>
+        <w:tc>
+          <w:tcPr>
+            <w:tcW w:type="dxa" w:w="3120"/>
+            <w:shd w:fill="FFFFFF"/>
+            <w:tcMar>
+              <w:top w:w="90" w:type="dxa"/>
+              <w:bottom w:w="90" w:type="dxa"/>
+              <w:left w:w="110" w:type="dxa"/>
+              <w:right w:w="110" w:type="dxa"/>
+            </w:tcMar>
+          </w:tcPr>
+          <w:p>
+            <w:r>
+              <w:rPr>
+                <w:b/>
+                <w:color w:val="1E3A8A"/>
+                <w:sz w:val="17"/>
+              </w:rPr>
+              <w:t>Minggu 1</w:t>
+            </w:r>
+          </w:p>
+        </w:tc>
+        <w:tc>
+          <w:tcPr>
+            <w:tcW w:type="dxa" w:w="3120"/>
+            <w:shd w:fill="FFFFFF"/>
+            <w:tcMar>
+              <w:top w:w="90" w:type="dxa"/>
+              <w:bottom w:w="90" w:type="dxa"/>
+              <w:left w:w="110" w:type="dxa"/>
+              <w:right w:w="110" w:type="dxa"/>
+            </w:tcMar>
+          </w:tcPr>
+          <w:p>
+            <w:r>
+              <w:rPr>
+                <w:color w:val="1F2937"/>
+                <w:sz w:val="17"/>
+              </w:rPr>
+              <w:t>Pemasangan sistem di server, konfigurasi database, dan penyusunan akun COA.</w:t>
+            </w:r>
+          </w:p>
+        </w:tc>
+        <w:tc>
+          <w:tcPr>
+            <w:tcW w:type="dxa" w:w="3120"/>
+            <w:shd w:fill="FFFFFF"/>
+            <w:tcMar>
+              <w:top w:w="90" w:type="dxa"/>
+              <w:bottom w:w="90" w:type="dxa"/>
+              <w:left w:w="110" w:type="dxa"/>
+              <w:right w:w="110" w:type="dxa"/>
+            </w:tcMar>
+          </w:tcPr>
+          <w:p>
+            <w:r>
+              <w:rPr>
+                <w:color w:val="1F2937"/>
+                <w:sz w:val="17"/>
+              </w:rPr>
+              <w:t>Server Berjalan &amp; Lingkungan Siap Pakai</w:t>
             </w:r>
           </w:p>
         </w:tc>
@@ -3088,10 +2614,10 @@
             <w:tcW w:type="dxa" w:w="3120"/>
             <w:shd w:fill="F9FAFB"/>
             <w:tcMar>
-              <w:top w:w="100" w:type="dxa"/>
-              <w:bottom w:w="100" w:type="dxa"/>
-              <w:left w:w="120" w:type="dxa"/>
-              <w:right w:w="120" w:type="dxa"/>
+              <w:top w:w="90" w:type="dxa"/>
+              <w:bottom w:w="90" w:type="dxa"/>
+              <w:left w:w="110" w:type="dxa"/>
+              <w:right w:w="110" w:type="dxa"/>
             </w:tcMar>
           </w:tcPr>
           <w:p>
@@ -3099,9 +2625,9 @@
               <w:rPr>
                 <w:b/>
                 <w:color w:val="1E3A8A"/>
-                <w:sz w:val="18"/>
+                <w:sz w:val="17"/>
               </w:rPr>
-              <w:t>Opsi 4: Pemulihan Bencana (Disaster Recovery)</w:t>
+              <w:t>Minggu 2</w:t>
             </w:r>
           </w:p>
         </w:tc>
@@ -3110,19 +2636,19 @@
             <w:tcW w:type="dxa" w:w="3120"/>
             <w:shd w:fill="F9FAFB"/>
             <w:tcMar>
-              <w:top w:w="100" w:type="dxa"/>
-              <w:bottom w:w="100" w:type="dxa"/>
-              <w:left w:w="120" w:type="dxa"/>
-              <w:right w:w="120" w:type="dxa"/>
+              <w:top w:w="90" w:type="dxa"/>
+              <w:bottom w:w="90" w:type="dxa"/>
+              <w:left w:w="110" w:type="dxa"/>
+              <w:right w:w="110" w:type="dxa"/>
             </w:tcMar>
           </w:tcPr>
           <w:p>
             <w:r>
               <w:rPr>
                 <w:color w:val="1F2937"/>
-                <w:sz w:val="18"/>
+                <w:sz w:val="17"/>
               </w:rPr>
-              <w:t>Pemulihan basis data akibat listrik padam mendadak, kerusakan hardware server, atau migrasi server darurat.</w:t>
+              <w:t>Impor data produk, barcode, harga jual, data pelanggan, supplier, dan stok awal.</w:t>
             </w:r>
           </w:p>
         </w:tc>
@@ -3131,20 +2657,19 @@
             <w:tcW w:type="dxa" w:w="3120"/>
             <w:shd w:fill="F9FAFB"/>
             <w:tcMar>
-              <w:top w:w="100" w:type="dxa"/>
-              <w:bottom w:w="100" w:type="dxa"/>
-              <w:left w:w="120" w:type="dxa"/>
-              <w:right w:w="120" w:type="dxa"/>
+              <w:top w:w="90" w:type="dxa"/>
+              <w:bottom w:w="90" w:type="dxa"/>
+              <w:left w:w="110" w:type="dxa"/>
+              <w:right w:w="110" w:type="dxa"/>
             </w:tcMar>
           </w:tcPr>
           <w:p>
             <w:r>
               <w:rPr>
-                <w:b/>
-                <w:color w:val="B45309"/>
-                <w:sz w:val="18"/>
+                <w:color w:val="1F2937"/>
+                <w:sz w:val="17"/>
               </w:rPr>
-              <w:t>Rp 2.500.000,- s/d Rp 4.000.000,- per insiden</w:t>
+              <w:t>Database Lengkap &amp; Tervalidasi dengan Data Riil</w:t>
             </w:r>
           </w:p>
         </w:tc>
@@ -3155,10 +2680,10 @@
             <w:tcW w:type="dxa" w:w="3120"/>
             <w:shd w:fill="FFFFFF"/>
             <w:tcMar>
-              <w:top w:w="100" w:type="dxa"/>
-              <w:bottom w:w="100" w:type="dxa"/>
-              <w:left w:w="120" w:type="dxa"/>
-              <w:right w:w="120" w:type="dxa"/>
+              <w:top w:w="90" w:type="dxa"/>
+              <w:bottom w:w="90" w:type="dxa"/>
+              <w:left w:w="110" w:type="dxa"/>
+              <w:right w:w="110" w:type="dxa"/>
             </w:tcMar>
           </w:tcPr>
           <w:p>
@@ -3166,9 +2691,9 @@
               <w:rPr>
                 <w:b/>
                 <w:color w:val="1E3A8A"/>
-                <w:sz w:val="18"/>
+                <w:sz w:val="17"/>
               </w:rPr>
-              <w:t>Opsi 5: Permintaan Fitur Baru (Change Request / CR)</w:t>
+              <w:t>Minggu 3</w:t>
             </w:r>
           </w:p>
         </w:tc>
@@ -3177,19 +2702,19 @@
             <w:tcW w:type="dxa" w:w="3120"/>
             <w:shd w:fill="FFFFFF"/>
             <w:tcMar>
-              <w:top w:w="100" w:type="dxa"/>
-              <w:bottom w:w="100" w:type="dxa"/>
-              <w:left w:w="120" w:type="dxa"/>
-              <w:right w:w="120" w:type="dxa"/>
+              <w:top w:w="90" w:type="dxa"/>
+              <w:bottom w:w="90" w:type="dxa"/>
+              <w:left w:w="110" w:type="dxa"/>
+              <w:right w:w="110" w:type="dxa"/>
             </w:tcMar>
           </w:tcPr>
           <w:p>
             <w:r>
               <w:rPr>
                 <w:color w:val="1F2937"/>
-                <w:sz w:val="18"/>
+                <w:sz w:val="17"/>
               </w:rPr>
-              <w:t>Klien menghendaki modul baru tambahan atau perubahan alur bisnis kustom di luar cakupan proposal awal.</w:t>
+              <w:t>Pelatihan langsung staf kasir, tim gudang, dan admin. Simulasi transaksi hulu-hilir.</w:t>
             </w:r>
           </w:p>
         </w:tc>
@@ -3198,28 +2723,98 @@
             <w:tcW w:type="dxa" w:w="3120"/>
             <w:shd w:fill="FFFFFF"/>
             <w:tcMar>
-              <w:top w:w="100" w:type="dxa"/>
-              <w:bottom w:w="100" w:type="dxa"/>
-              <w:left w:w="120" w:type="dxa"/>
-              <w:right w:w="120" w:type="dxa"/>
+              <w:top w:w="90" w:type="dxa"/>
+              <w:bottom w:w="90" w:type="dxa"/>
+              <w:left w:w="110" w:type="dxa"/>
+              <w:right w:w="110" w:type="dxa"/>
+            </w:tcMar>
+          </w:tcPr>
+          <w:p>
+            <w:r>
+              <w:rPr>
+                <w:color w:val="1F2937"/>
+                <w:sz w:val="17"/>
+              </w:rPr>
+              <w:t>Seluruh Staf Terlatih &amp; Terampil Menggunakan Sistem</w:t>
+            </w:r>
+          </w:p>
+        </w:tc>
+      </w:tr>
+      <w:tr>
+        <w:tc>
+          <w:tcPr>
+            <w:tcW w:type="dxa" w:w="3120"/>
+            <w:shd w:fill="F9FAFB"/>
+            <w:tcMar>
+              <w:top w:w="90" w:type="dxa"/>
+              <w:bottom w:w="90" w:type="dxa"/>
+              <w:left w:w="110" w:type="dxa"/>
+              <w:right w:w="110" w:type="dxa"/>
             </w:tcMar>
           </w:tcPr>
           <w:p>
             <w:r>
               <w:rPr>
                 <w:b/>
-                <w:color w:val="B45309"/>
-                <w:sz w:val="18"/>
+                <w:color w:val="1E3A8A"/>
+                <w:sz w:val="17"/>
               </w:rPr>
-              <w:t>Rp 1.000.000,- s/d Rp 1.500.000,- per hari kerja (man-day)</w:t>
+              <w:t>Minggu 4</w:t>
+            </w:r>
+          </w:p>
+        </w:tc>
+        <w:tc>
+          <w:tcPr>
+            <w:tcW w:type="dxa" w:w="3120"/>
+            <w:shd w:fill="F9FAFB"/>
+            <w:tcMar>
+              <w:top w:w="90" w:type="dxa"/>
+              <w:bottom w:w="90" w:type="dxa"/>
+              <w:left w:w="110" w:type="dxa"/>
+              <w:right w:w="110" w:type="dxa"/>
+            </w:tcMar>
+          </w:tcPr>
+          <w:p>
+            <w:r>
+              <w:rPr>
+                <w:color w:val="1F2937"/>
+                <w:sz w:val="17"/>
+              </w:rPr>
+              <w:t>Peluncuran resmi di toko (Go-Live), pendampingan kasir, dan serah terima dokumen.</w:t>
+            </w:r>
+          </w:p>
+        </w:tc>
+        <w:tc>
+          <w:tcPr>
+            <w:tcW w:type="dxa" w:w="3120"/>
+            <w:shd w:fill="F9FAFB"/>
+            <w:tcMar>
+              <w:top w:w="90" w:type="dxa"/>
+              <w:bottom w:w="90" w:type="dxa"/>
+              <w:left w:w="110" w:type="dxa"/>
+              <w:right w:w="110" w:type="dxa"/>
+            </w:tcMar>
+          </w:tcPr>
+          <w:p>
+            <w:r>
+              <w:rPr>
+                <w:color w:val="1F2937"/>
+                <w:sz w:val="17"/>
+              </w:rPr>
+              <w:t>Sistem Beroperasi Penuh Melayani Transaksi Nyata</w:t>
             </w:r>
           </w:p>
         </w:tc>
       </w:tr>
     </w:tbl>
     <w:p>
+      <w:r>
+        <w:br w:type="page"/>
+      </w:r>
+    </w:p>
+    <w:p>
       <w:pPr>
-        <w:spacing w:before="320" w:after="160"/>
+        <w:spacing w:before="240" w:after="160"/>
       </w:pPr>
       <w:r>
         <w:rPr>
@@ -3228,15 +2823,80 @@
           <w:color w:val="1E3A8A"/>
           <w:sz w:val="32"/>
         </w:rPr>
-        <w:t>8. Lembar Konfirmasi &amp; Persetujuan Kemitraan</w:t>
+        <w:t>7. Langkah Selanjutnya: Undangan Sesi Uji Coba (Live Demo)</w:t>
       </w:r>
     </w:p>
     <w:p>
       <w:pPr>
-        <w:spacing w:after="320" w:line="276" w:lineRule="auto"/>
+        <w:spacing w:after="160" w:line="276" w:lineRule="auto"/>
       </w:pPr>
       <w:r>
-        <w:t>Demikian proposal penawaran lisensi penuh Sistem Enterprise Inventory, POS &amp; Financial Governance ini kami sampaikan. Kami siap mendemonstrasikan sistem secara langsung dan mendampingi digitalisasi operasional bisnis perusahaan Anda. Untuk konfirmasi persetujuan penawaran atau penjadwalan demo aplikasi, silakan menandatangani lembar konfirmasi di bawah ini:</w:t>
+        <w:t>Memilih sistem operasional bisnis merupakan keputusan strategis bagi masa depan perusahaan Anda. Kami sangat memahami bahwa manajemen membutuhkan keyakinan penuh sebelum melakukan investasi.</w:t>
+      </w:r>
+    </w:p>
+    <w:p>
+      <w:pPr>
+        <w:spacing w:after="240" w:line="276" w:lineRule="auto"/>
+      </w:pPr>
+      <w:r>
+        <w:t>Oleh karena itu, kami dengan senang hati mengundang Bapak/Ibu beserta tim kunci untuk menghadiri **Sesi Pemaparan &amp; Uji Coba Langsung (Live Interactive Demo) selama 30 Menit**. Dalam sesi ini, kita dapat mensimulasikan alur transaksi kasir, mutasi stok, hingga terbentuknya laporan keuangan menggunakan contoh data bisnis riil.</w:t>
+      </w:r>
+    </w:p>
+    <w:tbl>
+      <w:tblPr>
+        <w:tblW w:type="auto" w:w="0"/>
+        <w:jc w:val="center"/>
+        <w:tblLook w:firstColumn="1" w:firstRow="1" w:lastColumn="0" w:lastRow="0" w:noHBand="0" w:noVBand="1" w:val="04A0"/>
+      </w:tblPr>
+      <w:tblGrid>
+        <w:gridCol w:w="9360"/>
+      </w:tblGrid>
+      <w:tr>
+        <w:tc>
+          <w:tcPr>
+            <w:tcW w:type="dxa" w:w="9360"/>
+            <w:shd w:fill="EFF6FF"/>
+            <w:tcMar>
+              <w:top w:w="150" w:type="dxa"/>
+              <w:bottom w:w="150" w:type="dxa"/>
+              <w:left w:w="180" w:type="dxa"/>
+              <w:right w:w="180" w:type="dxa"/>
+            </w:tcMar>
+          </w:tcPr>
+          <w:p>
+            <w:r>
+              <w:rPr>
+                <w:b/>
+                <w:color w:val="1E3A8A"/>
+                <w:sz w:val="20"/>
+              </w:rPr>
+              <w:t>🌟 JAMINAN TANPA RESIKO &amp; TANPA KOMITMEN:</w:t>
+              <w:br/>
+            </w:r>
+            <w:r>
+              <w:rPr>
+                <w:color w:val="1F2937"/>
+                <w:sz w:val="19"/>
+              </w:rPr>
+              <w:t>Sesi demo ini bersifat 100% informatif dan gratis. Tidak ada kewajiban ataupun komitmen apapun dari pihak Bapak/Ibu untuk melakukan pembelian. Tujuannya murni untuk memberikan gambaran nyata bagaimana sistem ini dapat memangkas kebocoran dan menghemat jam kerja tim operasional Anda.</w:t>
+            </w:r>
+          </w:p>
+        </w:tc>
+      </w:tr>
+    </w:tbl>
+    <w:p/>
+    <w:p/>
+    <w:p>
+      <w:pPr>
+        <w:spacing w:after="80"/>
+      </w:pPr>
+      <w:r>
+        <w:rPr>
+          <w:b/>
+          <w:color w:val="1E3A8A"/>
+          <w:sz w:val="22"/>
+        </w:rPr>
+        <w:t>Formulir Permintaan Jadwal Sesi Live Demo:</w:t>
       </w:r>
     </w:p>
     <w:tbl>
@@ -3252,35 +2912,30 @@
       <w:tr>
         <w:tc>
           <w:tcPr>
-            <w:tcW w:type="dxa" w:w="4608"/>
+            <w:tcW w:type="dxa" w:w="3456"/>
           </w:tcPr>
           <w:p>
             <w:r>
               <w:rPr>
                 <w:b/>
                 <w:color w:val="1E3A8A"/>
-                <w:sz w:val="20"/>
+                <w:sz w:val="19"/>
               </w:rPr>
-              <w:t>Disetujui Oleh Pihak Klien:</w:t>
-              <w:br/>
-              <w:t>(Manajemen / Direksi Perusahaan)</w:t>
+              <w:t>Nama Perusahaan / Usaha</w:t>
             </w:r>
           </w:p>
         </w:tc>
         <w:tc>
           <w:tcPr>
-            <w:tcW w:type="dxa" w:w="4608"/>
+            <w:tcW w:type="dxa" w:w="5904"/>
           </w:tcPr>
           <w:p>
             <w:r>
               <w:rPr>
-                <w:b/>
-                <w:color w:val="1E3A8A"/>
-                <w:sz w:val="20"/>
+                <w:color w:val="1F2937"/>
+                <w:sz w:val="19"/>
               </w:rPr>
-              <w:t>Diajukan Oleh Pihak Pengembang:</w:t>
-              <w:br/>
-              <w:t>(Tim Solusi Sistem Enterprise)</w:t>
+              <w:t>: __________________________________________________</w:t>
             </w:r>
           </w:p>
         </w:tc>
@@ -3288,21 +2943,30 @@
       <w:tr>
         <w:tc>
           <w:tcPr>
-            <w:tcW w:type="dxa" w:w="4680"/>
+            <w:tcW w:type="dxa" w:w="3456"/>
           </w:tcPr>
           <w:p>
             <w:r>
-              <w:br/>
+              <w:rPr>
+                <w:b/>
+                <w:color w:val="1E3A8A"/>
+                <w:sz w:val="19"/>
+              </w:rPr>
+              <w:t>Nama Kontak / PIC</w:t>
             </w:r>
           </w:p>
         </w:tc>
         <w:tc>
           <w:tcPr>
-            <w:tcW w:type="dxa" w:w="4680"/>
+            <w:tcW w:type="dxa" w:w="5904"/>
           </w:tcPr>
           <w:p>
             <w:r>
-              <w:br/>
+              <w:rPr>
+                <w:color w:val="1F2937"/>
+                <w:sz w:val="19"/>
+              </w:rPr>
+              <w:t>: __________________________________________________</w:t>
             </w:r>
           </w:p>
         </w:tc>
@@ -3310,21 +2974,30 @@
       <w:tr>
         <w:tc>
           <w:tcPr>
-            <w:tcW w:type="dxa" w:w="4680"/>
+            <w:tcW w:type="dxa" w:w="3456"/>
           </w:tcPr>
           <w:p>
             <w:r>
-              <w:br/>
+              <w:rPr>
+                <w:b/>
+                <w:color w:val="1E3A8A"/>
+                <w:sz w:val="19"/>
+              </w:rPr>
+              <w:t>Jabatan</w:t>
             </w:r>
           </w:p>
         </w:tc>
         <w:tc>
           <w:tcPr>
-            <w:tcW w:type="dxa" w:w="4680"/>
+            <w:tcW w:type="dxa" w:w="5904"/>
           </w:tcPr>
           <w:p>
             <w:r>
-              <w:br/>
+              <w:rPr>
+                <w:color w:val="1F2937"/>
+                <w:sz w:val="19"/>
+              </w:rPr>
+              <w:t>: __________________________________________________</w:t>
             </w:r>
           </w:p>
         </w:tc>
@@ -3332,21 +3005,30 @@
       <w:tr>
         <w:tc>
           <w:tcPr>
-            <w:tcW w:type="dxa" w:w="4680"/>
+            <w:tcW w:type="dxa" w:w="3456"/>
           </w:tcPr>
           <w:p>
             <w:r>
-              <w:br/>
+              <w:rPr>
+                <w:b/>
+                <w:color w:val="1E3A8A"/>
+                <w:sz w:val="19"/>
+              </w:rPr>
+              <w:t>No. WhatsApp / Email</w:t>
             </w:r>
           </w:p>
         </w:tc>
         <w:tc>
           <w:tcPr>
-            <w:tcW w:type="dxa" w:w="4680"/>
+            <w:tcW w:type="dxa" w:w="5904"/>
           </w:tcPr>
           <w:p>
             <w:r>
-              <w:br/>
+              <w:rPr>
+                <w:color w:val="1F2937"/>
+                <w:sz w:val="19"/>
+              </w:rPr>
+              <w:t>: __________________________________________________</w:t>
             </w:r>
           </w:p>
         </w:tc>
@@ -3354,40 +3036,98 @@
       <w:tr>
         <w:tc>
           <w:tcPr>
-            <w:tcW w:type="dxa" w:w="4680"/>
+            <w:tcW w:type="dxa" w:w="3456"/>
           </w:tcPr>
           <w:p>
             <w:r>
               <w:rPr>
+                <w:b/>
+                <w:color w:val="1E3A8A"/>
                 <w:sz w:val="19"/>
               </w:rPr>
-              <w:t>Nama: _________________________</w:t>
-              <w:br/>
-              <w:t>Jabatan: ______________________</w:t>
-              <w:br/>
-              <w:t>Tanggal: ______________________</w:t>
+              <w:t>Pilihan Paket yang Diminati</w:t>
             </w:r>
           </w:p>
         </w:tc>
         <w:tc>
           <w:tcPr>
-            <w:tcW w:type="dxa" w:w="4680"/>
+            <w:tcW w:type="dxa" w:w="5904"/>
           </w:tcPr>
           <w:p>
             <w:r>
               <w:rPr>
+                <w:color w:val="1F2937"/>
                 <w:sz w:val="19"/>
               </w:rPr>
-              <w:t>Nama: _________________________</w:t>
-              <w:br/>
-              <w:t>Jabatan: Solution Architect / Lead</w:t>
-              <w:br/>
-              <w:t>Tanggal: ______________________</w:t>
+              <w:t>: [  ] Paket STARTER      [  ] Paket ENTERPRISE</w:t>
+            </w:r>
+          </w:p>
+        </w:tc>
+      </w:tr>
+      <w:tr>
+        <w:tc>
+          <w:tcPr>
+            <w:tcW w:type="dxa" w:w="3456"/>
+          </w:tcPr>
+          <w:p>
+            <w:r>
+              <w:rPr>
+                <w:b/>
+                <w:color w:val="1E3A8A"/>
+                <w:sz w:val="19"/>
+              </w:rPr>
+              <w:t>Rencana Waktu Sesi Demo</w:t>
+            </w:r>
+          </w:p>
+        </w:tc>
+        <w:tc>
+          <w:tcPr>
+            <w:tcW w:type="dxa" w:w="5904"/>
+          </w:tcPr>
+          <w:p>
+            <w:r>
+              <w:rPr>
+                <w:color w:val="1F2937"/>
+                <w:sz w:val="19"/>
+              </w:rPr>
+              <w:t>: Hari/Tanggal: ___________________ Jam: ____________</w:t>
             </w:r>
           </w:p>
         </w:tc>
       </w:tr>
     </w:tbl>
+    <w:p/>
+    <w:p/>
+    <w:p>
+      <w:pPr>
+        <w:jc w:val="center"/>
+      </w:pPr>
+      <w:r>
+        <w:rPr>
+          <w:color w:val="6B7280"/>
+          <w:sz w:val="19"/>
+        </w:rPr>
+        <w:t>Hubungi Tim Kami untuk Koordinasi Jadwal Demo &amp; Konsultasi Kebutuhan:</w:t>
+        <w:br/>
+      </w:r>
+      <w:r>
+        <w:rPr>
+          <w:b/>
+          <w:color w:val="1E3A8A"/>
+          <w:sz w:val="20"/>
+        </w:rPr>
+        <w:t>WhatsApp / Telp: [Nomor Kontak Anda]  |  Email: [Email Bisnis Anda]</w:t>
+        <w:br/>
+      </w:r>
+      <w:r>
+        <w:rPr>
+          <w:i/>
+          <w:color w:val="6B7280"/>
+          <w:sz w:val="17"/>
+        </w:rPr>
+        <w:t>Tersedia untuk Sesi Demo Langsung (On-Site di Kantor Anda) maupun Demo Online (Zoom / Google Meet).</w:t>
+      </w:r>
+    </w:p>
     <w:sectPr>
       <w:footerReference w:type="default" r:id="rId9"/>
       <w:pgSz w:w="12240" w:h="15840"/>
@@ -3412,7 +3152,7 @@
         <w:color w:val="9CA3AF"/>
         <w:sz w:val="17"/>
       </w:rPr>
-      <w:t>Proposal Penawaran Lisensi Sistem Terpadu: Inventory + POS + Finance | Dokumen Resmi</w:t>
+      <w:t>Proposal Solusi Sistem Terpadu: Inventory + POS + Finance | Konsultasi Solusi Bisnis</w:t>
     </w:r>
   </w:p>
 </w:ftr>

</xml_diff>